<commit_message>
Add the printable character sheet pipeline and protect the Word golden.
Extract ficha.docx from the manual, guard rebuilds with --force, normalize PbtA branding, and consolidate the editorial docs and scripts.

Co-authored-by: Cursor <cursoragent@cursor.com>
</commit_message>
<xml_diff>
--- a/cyberpunk-pbta.docx
+++ b/cyberpunk-pbta.docx
@@ -98,7 +98,7 @@
           <w:rFonts w:ascii="Courier New" w:eastAsia="Courier New" w:hAnsi="Courier New" w:cs="Courier New"/>
           <w:lang w:val="es-AR"/>
         </w:rPr>
-        <w:t>pbta:\&gt;/___/                   /_/                       </w:t>
+        <w:t>PbtA:\&gt;/___/                   /_/                       </w:t>
       </w:r>
     </w:p>
     <w:p>
@@ -22582,10 +22582,14 @@
       <w:pPr>
         <w:pStyle w:val="Ttulo3"/>
         <w:shd w:val="clear" w:color="auto" w:fill="0A0A0A"/>
+        <w:rPr>
+          <w:lang w:val="es-AR"/>
+        </w:rPr>
       </w:pPr>
       <w:r>
         <w:rPr>
           <w:rFonts w:ascii="VT323" w:eastAsia="VT323" w:hAnsi="VT323" w:cs="VT323"/>
+          <w:lang w:val="es-AR"/>
         </w:rPr>
         <w:lastRenderedPageBreak/>
         <w:t>Pistola garfio</w:t>
@@ -24209,9 +24213,8 @@
           <w:lang w:val="es-AR"/>
         </w:rPr>
         <w:sectPr>
-          <w:type w:val="nextColumn"/>
           <w:pgSz w:w="11906" w:h="16838"/>
-          <w:pgMar w:top="685" w:right="284" w:bottom="284" w:left="284" w:header="266" w:footer="397" w:gutter="0"/>
+          <w:pgMar w:top="685" w:right="284" w:bottom="284" w:left="284" w:header="284" w:footer="454" w:gutter="0"/>
           <w:cols w:space="283"/>
           <w:docGrid w:linePitch="360"/>
         </w:sectPr>
@@ -24220,15 +24223,21 @@
         <w:rPr>
           <w:lang w:val="es-AR"/>
         </w:rPr>
-        <w:t>=======================</w:t>
-      </w:r>
-    </w:p>
-    <w:p>
-      <w:pPr>
-        <w:shd w:val="clear" w:color="auto" w:fill="0A0A0A"/>
-        <w:spacing w:after="0"/>
-        <w:rPr>
-          <w:b/>
+        <w:t>======================</w:t>
+      </w:r>
+      <w:r>
+        <w:rPr>
+          <w:lang w:val="es-AR"/>
+        </w:rPr>
+        <w:t>==</w:t>
+      </w:r>
+    </w:p>
+    <w:p>
+      <w:pPr>
+        <w:pStyle w:val="PBTAPartDeco"/>
+        <w:shd w:val="clear" w:color="auto" w:fill="0A0A0A"/>
+        <w:rPr>
+          <w:b w:val="0"/>
           <w:color w:val="00FF00"/>
           <w:lang w:val="es-AR"/>
         </w:rPr>
@@ -24236,20 +24245,12 @@
     </w:p>
     <w:p>
       <w:pPr>
-        <w:pStyle w:val="Prrafodelista"/>
-        <w:numPr>
-          <w:ilvl w:val="0"/>
-          <w:numId w:val="3"/>
-        </w:numPr>
         <w:shd w:val="clear" w:color="auto" w:fill="0A0A0A"/>
         <w:tabs>
-          <w:tab w:val="clear" w:pos="284"/>
           <w:tab w:val="clear" w:pos="2520"/>
           <w:tab w:val="clear" w:pos="5040"/>
         </w:tabs>
         <w:spacing w:after="130"/>
-        <w:ind w:left="142" w:hanging="142"/>
-        <w:contextualSpacing w:val="0"/>
         <w:rPr>
           <w:lang w:val="es-AR"/>
         </w:rPr>
@@ -26210,11 +26211,2580 @@
         <w:t>----------------------------</w:t>
       </w:r>
     </w:p>
+    <w:p>
+      <w:pPr>
+        <w:rPr>
+          <w:lang w:val="es-AR"/>
+        </w:rPr>
+        <w:sectPr>
+          <w:type w:val="continuous"/>
+          <w:pgSz w:w="11906" w:h="16838"/>
+          <w:pgMar w:top="685" w:right="284" w:bottom="284" w:left="284" w:header="284" w:footer="454" w:gutter="0"/>
+          <w:cols w:num="2" w:space="283"/>
+          <w:docGrid w:linePitch="360"/>
+        </w:sectPr>
+      </w:pPr>
+    </w:p>
+    <w:p>
+      <w:pPr>
+        <w:widowControl w:val="0"/>
+        <w:shd w:val="clear" w:color="auto" w:fill="FFFFFF"/>
+        <w:wordWrap w:val="0"/>
+        <w:spacing w:after="0" w:line="330" w:lineRule="exact"/>
+        <w:rPr>
+          <w:b/>
+          <w:bCs/>
+          <w:lang w:val="es-AR"/>
+        </w:rPr>
+      </w:pPr>
+      <w:r>
+        <w:rPr>
+          <w:color w:val="000000"/>
+          <w:sz w:val="32"/>
+          <w:lang w:val="es-AR"/>
+        </w:rPr>
+        <w:lastRenderedPageBreak/>
+        <w:t xml:space="preserve">                                     </w:t>
+      </w:r>
+      <w:r>
+        <w:rPr>
+          <w:color w:val="000000"/>
+          <w:sz w:val="32"/>
+          <w:lang w:val="es-AR"/>
+        </w:rPr>
+        <w:t xml:space="preserve"> </w:t>
+      </w:r>
+      <w:r>
+        <w:rPr>
+          <w:rFonts w:ascii="MS Mincho" w:eastAsia="MS Mincho" w:hAnsi="MS Mincho" w:cs="MS Mincho" w:hint="eastAsia"/>
+          <w:b/>
+          <w:bCs/>
+          <w:color w:val="auto"/>
+          <w:lang w:val="es-AR"/>
+        </w:rPr>
+        <w:t>┌</w:t>
+      </w:r>
+      <w:r>
+        <w:rPr>
+          <w:b/>
+          <w:bCs/>
+          <w:color w:val="auto"/>
+          <w:sz w:val="32"/>
+          <w:lang w:val="es-AR"/>
+        </w:rPr>
+        <w:t xml:space="preserve">              </w:t>
+      </w:r>
+      <w:r>
+        <w:rPr>
+          <w:rFonts w:ascii="MS Mincho" w:eastAsia="MS Mincho" w:hAnsi="MS Mincho" w:cs="MS Mincho" w:hint="eastAsia"/>
+          <w:b/>
+          <w:bCs/>
+          <w:color w:val="auto"/>
+          <w:lang w:val="es-AR"/>
+        </w:rPr>
+        <w:t>┐</w:t>
+      </w:r>
+      <w:r>
+        <w:rPr>
+          <w:b/>
+          <w:bCs/>
+          <w:color w:val="000000"/>
+          <w:sz w:val="32"/>
+          <w:lang w:val="es-AR"/>
+        </w:rPr>
+        <w:t xml:space="preserve">                             </w:t>
+      </w:r>
+    </w:p>
+    <w:p>
+      <w:pPr>
+        <w:widowControl w:val="0"/>
+        <w:shd w:val="clear" w:color="auto" w:fill="FFFFFF"/>
+        <w:wordWrap w:val="0"/>
+        <w:spacing w:after="0" w:line="330" w:lineRule="exact"/>
+        <w:rPr>
+          <w:lang w:val="es-AR"/>
+        </w:rPr>
+      </w:pPr>
+      <w:r>
+        <w:rPr>
+          <w:color w:val="000000"/>
+          <w:sz w:val="32"/>
+          <w:lang w:val="es-AR"/>
+        </w:rPr>
+        <w:t>Nombre:\&gt;</w:t>
+      </w:r>
+      <w:r>
+        <w:rPr>
+          <w:color w:val="A6A6A6" w:themeColor="background1" w:themeShade="A6"/>
+          <w:sz w:val="32"/>
+          <w:lang w:val="es-AR"/>
+        </w:rPr>
+        <w:t>____________________________</w:t>
+      </w:r>
+      <w:r>
+        <w:rPr>
+          <w:color w:val="000000"/>
+          <w:sz w:val="32"/>
+          <w:lang w:val="es-AR"/>
+        </w:rPr>
+        <w:t xml:space="preserve"> </w:t>
+      </w:r>
+      <w:r>
+        <w:rPr>
+          <w:rFonts w:ascii="MS Mincho" w:eastAsia="MS Mincho" w:hAnsi="MS Mincho" w:cs="MS Mincho" w:hint="eastAsia"/>
+          <w:b/>
+          <w:bCs/>
+          <w:color w:val="auto"/>
+          <w:lang w:val="es-AR"/>
+        </w:rPr>
+        <w:t>│</w:t>
+      </w:r>
+      <w:r>
+        <w:rPr>
+          <w:b/>
+          <w:bCs/>
+          <w:color w:val="auto"/>
+          <w:sz w:val="32"/>
+          <w:lang w:val="es-AR"/>
+        </w:rPr>
+        <w:t xml:space="preserve">              </w:t>
+      </w:r>
+      <w:r>
+        <w:rPr>
+          <w:rFonts w:ascii="MS Mincho" w:eastAsia="MS Mincho" w:hAnsi="MS Mincho" w:cs="MS Mincho" w:hint="eastAsia"/>
+          <w:b/>
+          <w:bCs/>
+          <w:color w:val="auto"/>
+          <w:lang w:val="es-AR"/>
+        </w:rPr>
+        <w:t>│</w:t>
+      </w:r>
+      <w:r>
+        <w:rPr>
+          <w:color w:val="000000"/>
+          <w:sz w:val="32"/>
+          <w:lang w:val="es-AR"/>
+        </w:rPr>
+        <w:t xml:space="preserve"> Enlaces Neuronales</w:t>
+      </w:r>
+      <w:r>
+        <w:rPr>
+          <w:color w:val="A6A6A6" w:themeColor="background1" w:themeShade="A6"/>
+          <w:sz w:val="32"/>
+          <w:lang w:val="es-AR"/>
+        </w:rPr>
+        <w:t>____</w:t>
+      </w:r>
+      <w:r>
+        <w:rPr>
+          <w:color w:val="A6A6A6" w:themeColor="background1" w:themeShade="A6"/>
+          <w:sz w:val="32"/>
+          <w:lang w:val="es-AR"/>
+        </w:rPr>
+        <w:t>_</w:t>
+      </w:r>
+      <w:r>
+        <w:rPr>
+          <w:color w:val="A6A6A6" w:themeColor="background1" w:themeShade="A6"/>
+          <w:sz w:val="32"/>
+          <w:lang w:val="es-AR"/>
+        </w:rPr>
+        <w:t>___</w:t>
+      </w:r>
+      <w:r>
+        <w:rPr>
+          <w:color w:val="000000"/>
+          <w:sz w:val="32"/>
+          <w:lang w:val="es-AR"/>
+        </w:rPr>
+        <w:t>[    ]</w:t>
+      </w:r>
+    </w:p>
+    <w:p>
+      <w:pPr>
+        <w:widowControl w:val="0"/>
+        <w:shd w:val="clear" w:color="auto" w:fill="FFFFFF"/>
+        <w:wordWrap w:val="0"/>
+        <w:spacing w:after="0" w:line="330" w:lineRule="exact"/>
+        <w:rPr>
+          <w:lang w:val="es-AR"/>
+        </w:rPr>
+      </w:pPr>
+      <w:r>
+        <w:rPr>
+          <w:color w:val="000000"/>
+          <w:sz w:val="32"/>
+          <w:lang w:val="es-AR"/>
+        </w:rPr>
+        <w:t>Jugador:\&gt;</w:t>
+      </w:r>
+      <w:r>
+        <w:rPr>
+          <w:color w:val="A6A6A6" w:themeColor="background1" w:themeShade="A6"/>
+          <w:sz w:val="32"/>
+          <w:lang w:val="es-AR"/>
+        </w:rPr>
+        <w:t>___________________________</w:t>
+      </w:r>
+      <w:r>
+        <w:rPr>
+          <w:color w:val="000000"/>
+          <w:sz w:val="32"/>
+          <w:lang w:val="es-AR"/>
+        </w:rPr>
+        <w:t xml:space="preserve"> </w:t>
+      </w:r>
+      <w:r>
+        <w:rPr>
+          <w:rFonts w:ascii="MS Mincho" w:eastAsia="MS Mincho" w:hAnsi="MS Mincho" w:cs="MS Mincho" w:hint="eastAsia"/>
+          <w:b/>
+          <w:bCs/>
+          <w:color w:val="auto"/>
+          <w:lang w:val="es-AR"/>
+        </w:rPr>
+        <w:t>│</w:t>
+      </w:r>
+      <w:r>
+        <w:rPr>
+          <w:color w:val="auto"/>
+          <w:sz w:val="32"/>
+          <w:lang w:val="es-AR"/>
+        </w:rPr>
+        <w:t xml:space="preserve">              </w:t>
+      </w:r>
+      <w:r>
+        <w:rPr>
+          <w:rFonts w:ascii="MS Mincho" w:eastAsia="MS Mincho" w:hAnsi="MS Mincho" w:cs="MS Mincho" w:hint="eastAsia"/>
+          <w:b/>
+          <w:bCs/>
+          <w:color w:val="auto"/>
+          <w:lang w:val="es-AR"/>
+        </w:rPr>
+        <w:t>│</w:t>
+      </w:r>
+      <w:r>
+        <w:rPr>
+          <w:color w:val="000000"/>
+          <w:sz w:val="32"/>
+          <w:lang w:val="es-AR"/>
+        </w:rPr>
+        <w:t xml:space="preserve"> Manipulación Cognitiva</w:t>
+      </w:r>
+      <w:r>
+        <w:rPr>
+          <w:color w:val="A6A6A6" w:themeColor="background1" w:themeShade="A6"/>
+          <w:sz w:val="32"/>
+          <w:lang w:val="es-AR"/>
+        </w:rPr>
+        <w:t>____</w:t>
+      </w:r>
+      <w:r>
+        <w:rPr>
+          <w:color w:val="000000"/>
+          <w:sz w:val="32"/>
+          <w:lang w:val="es-AR"/>
+        </w:rPr>
+        <w:t>[    ]</w:t>
+      </w:r>
+    </w:p>
+    <w:p>
+      <w:pPr>
+        <w:widowControl w:val="0"/>
+        <w:shd w:val="clear" w:color="auto" w:fill="FFFFFF"/>
+        <w:wordWrap w:val="0"/>
+        <w:spacing w:after="0" w:line="330" w:lineRule="exact"/>
+        <w:rPr>
+          <w:lang w:val="es-AR"/>
+        </w:rPr>
+      </w:pPr>
+      <w:r>
+        <w:rPr>
+          <w:color w:val="000000"/>
+          <w:sz w:val="32"/>
+          <w:lang w:val="es-AR"/>
+        </w:rPr>
+        <w:t>Profesión:\&gt;</w:t>
+      </w:r>
+      <w:r>
+        <w:rPr>
+          <w:color w:val="A6A6A6" w:themeColor="background1" w:themeShade="A6"/>
+          <w:sz w:val="32"/>
+          <w:lang w:val="es-AR"/>
+        </w:rPr>
+        <w:t>_________________________</w:t>
+      </w:r>
+      <w:r>
+        <w:rPr>
+          <w:color w:val="A6A6A6" w:themeColor="background1" w:themeShade="A6"/>
+          <w:sz w:val="32"/>
+          <w:lang w:val="es-AR"/>
+        </w:rPr>
+        <w:t xml:space="preserve"> </w:t>
+      </w:r>
+      <w:r>
+        <w:rPr>
+          <w:rFonts w:ascii="MS Mincho" w:eastAsia="MS Mincho" w:hAnsi="MS Mincho" w:cs="MS Mincho" w:hint="eastAsia"/>
+          <w:b/>
+          <w:bCs/>
+          <w:color w:val="auto"/>
+          <w:lang w:val="es-AR"/>
+        </w:rPr>
+        <w:t>│</w:t>
+      </w:r>
+      <w:r>
+        <w:rPr>
+          <w:color w:val="auto"/>
+          <w:sz w:val="32"/>
+          <w:lang w:val="es-AR"/>
+        </w:rPr>
+        <w:t xml:space="preserve">              </w:t>
+      </w:r>
+      <w:r>
+        <w:rPr>
+          <w:rFonts w:ascii="MS Mincho" w:eastAsia="MS Mincho" w:hAnsi="MS Mincho" w:cs="MS Mincho" w:hint="eastAsia"/>
+          <w:b/>
+          <w:bCs/>
+          <w:color w:val="auto"/>
+          <w:lang w:val="es-AR"/>
+        </w:rPr>
+        <w:t>│</w:t>
+      </w:r>
+      <w:r>
+        <w:rPr>
+          <w:color w:val="000000"/>
+          <w:sz w:val="32"/>
+          <w:lang w:val="es-AR"/>
+        </w:rPr>
+        <w:t xml:space="preserve"> Reacción Cinética</w:t>
+      </w:r>
+      <w:r>
+        <w:rPr>
+          <w:color w:val="A6A6A6" w:themeColor="background1" w:themeShade="A6"/>
+          <w:sz w:val="32"/>
+          <w:lang w:val="es-AR"/>
+        </w:rPr>
+        <w:t>_________</w:t>
+      </w:r>
+      <w:r>
+        <w:rPr>
+          <w:color w:val="000000"/>
+          <w:sz w:val="32"/>
+          <w:lang w:val="es-AR"/>
+        </w:rPr>
+        <w:t>[    ]</w:t>
+      </w:r>
+    </w:p>
+    <w:p>
+      <w:pPr>
+        <w:widowControl w:val="0"/>
+        <w:shd w:val="clear" w:color="auto" w:fill="FFFFFF"/>
+        <w:wordWrap w:val="0"/>
+        <w:spacing w:after="0" w:line="330" w:lineRule="exact"/>
+        <w:rPr>
+          <w:lang w:val="es-AR"/>
+        </w:rPr>
+      </w:pPr>
+      <w:r>
+        <w:rPr>
+          <w:color w:val="000000"/>
+          <w:sz w:val="32"/>
+          <w:lang w:val="es-AR"/>
+        </w:rPr>
+        <w:t xml:space="preserve">@Psique:\&gt; [  ] [  ] [  ] [ </w:t>
+      </w:r>
+      <w:r>
+        <w:rPr>
+          <w:color w:val="A6A6A6" w:themeColor="background1" w:themeShade="A6"/>
+          <w:sz w:val="32"/>
+          <w:lang w:val="es-AR"/>
+        </w:rPr>
+        <w:t>*</w:t>
+      </w:r>
+      <w:r>
+        <w:rPr>
+          <w:color w:val="000000"/>
+          <w:sz w:val="32"/>
+          <w:lang w:val="es-AR"/>
+        </w:rPr>
+        <w:t xml:space="preserve"> ] [ </w:t>
+      </w:r>
+      <w:r>
+        <w:rPr>
+          <w:color w:val="A6A6A6" w:themeColor="background1" w:themeShade="A6"/>
+          <w:sz w:val="32"/>
+          <w:lang w:val="es-AR"/>
+        </w:rPr>
+        <w:t>*</w:t>
+      </w:r>
+      <w:r>
+        <w:rPr>
+          <w:color w:val="000000"/>
+          <w:sz w:val="32"/>
+          <w:lang w:val="es-AR"/>
+        </w:rPr>
+        <w:t xml:space="preserve"> ] </w:t>
+      </w:r>
+      <w:r>
+        <w:rPr>
+          <w:rFonts w:ascii="MS Mincho" w:eastAsia="MS Mincho" w:hAnsi="MS Mincho" w:cs="MS Mincho" w:hint="eastAsia"/>
+          <w:b/>
+          <w:bCs/>
+          <w:color w:val="auto"/>
+          <w:lang w:val="es-AR"/>
+        </w:rPr>
+        <w:t>│</w:t>
+      </w:r>
+      <w:r>
+        <w:rPr>
+          <w:color w:val="auto"/>
+          <w:sz w:val="32"/>
+          <w:lang w:val="es-AR"/>
+        </w:rPr>
+        <w:t xml:space="preserve">              </w:t>
+      </w:r>
+      <w:r>
+        <w:rPr>
+          <w:rFonts w:ascii="MS Mincho" w:eastAsia="MS Mincho" w:hAnsi="MS Mincho" w:cs="MS Mincho" w:hint="eastAsia"/>
+          <w:b/>
+          <w:bCs/>
+          <w:color w:val="auto"/>
+          <w:lang w:val="es-AR"/>
+        </w:rPr>
+        <w:t>│</w:t>
+      </w:r>
+      <w:r>
+        <w:rPr>
+          <w:color w:val="000000"/>
+          <w:sz w:val="32"/>
+          <w:lang w:val="es-AR"/>
+        </w:rPr>
+        <w:t xml:space="preserve"> Tejido Muscular</w:t>
+      </w:r>
+      <w:r>
+        <w:rPr>
+          <w:color w:val="A6A6A6" w:themeColor="background1" w:themeShade="A6"/>
+          <w:sz w:val="32"/>
+          <w:lang w:val="es-AR"/>
+        </w:rPr>
+        <w:t>___________</w:t>
+      </w:r>
+      <w:r>
+        <w:rPr>
+          <w:color w:val="000000"/>
+          <w:sz w:val="32"/>
+          <w:lang w:val="es-AR"/>
+        </w:rPr>
+        <w:t>[    ]</w:t>
+      </w:r>
+    </w:p>
+    <w:p>
+      <w:pPr>
+        <w:widowControl w:val="0"/>
+        <w:shd w:val="clear" w:color="auto" w:fill="FFFFFF"/>
+        <w:wordWrap w:val="0"/>
+        <w:spacing w:after="0" w:line="330" w:lineRule="exact"/>
+        <w:rPr>
+          <w:color w:val="000000"/>
+          <w:sz w:val="32"/>
+          <w:szCs w:val="32"/>
+          <w:lang w:val="es-AR"/>
+        </w:rPr>
+      </w:pPr>
+      <w:r>
+        <w:rPr>
+          <w:color w:val="000000"/>
+          <w:sz w:val="32"/>
+          <w:szCs w:val="32"/>
+          <w:lang w:val="es-AR"/>
+        </w:rPr>
+        <w:t xml:space="preserve">                                      </w:t>
+      </w:r>
+      <w:r>
+        <w:rPr>
+          <w:rFonts w:ascii="MS Mincho" w:eastAsia="MS Mincho" w:hAnsi="MS Mincho" w:cs="MS Mincho" w:hint="eastAsia"/>
+          <w:b/>
+          <w:bCs/>
+          <w:color w:val="auto"/>
+          <w:lang w:val="es-AR"/>
+        </w:rPr>
+        <w:t>└</w:t>
+      </w:r>
+      <w:r>
+        <w:rPr>
+          <w:color w:val="auto"/>
+          <w:sz w:val="32"/>
+          <w:szCs w:val="32"/>
+          <w:lang w:val="es-AR"/>
+        </w:rPr>
+        <w:t xml:space="preserve">              </w:t>
+      </w:r>
+      <w:r>
+        <w:rPr>
+          <w:rFonts w:ascii="MS Mincho" w:eastAsia="MS Mincho" w:hAnsi="MS Mincho" w:cs="MS Mincho" w:hint="eastAsia"/>
+          <w:b/>
+          <w:bCs/>
+          <w:color w:val="auto"/>
+          <w:lang w:val="es-AR"/>
+        </w:rPr>
+        <w:t>┘</w:t>
+      </w:r>
+    </w:p>
+    <w:p>
+      <w:pPr>
+        <w:widowControl w:val="0"/>
+        <w:shd w:val="clear" w:color="auto" w:fill="FFFFFF"/>
+        <w:wordWrap w:val="0"/>
+        <w:spacing w:after="0" w:line="330" w:lineRule="exact"/>
+        <w:rPr>
+          <w:lang w:val="es-AR"/>
+        </w:rPr>
+      </w:pPr>
+      <w:r>
+        <w:rPr>
+          <w:color w:val="000000"/>
+          <w:sz w:val="32"/>
+          <w:lang w:val="es-AR"/>
+        </w:rPr>
+        <w:t xml:space="preserve">                            </w:t>
+      </w:r>
+      <w:r>
+        <w:rPr>
+          <w:color w:val="000000"/>
+          <w:sz w:val="32"/>
+          <w:lang w:val="es-AR"/>
+        </w:rPr>
+        <w:t xml:space="preserve">   </w:t>
+      </w:r>
+      <w:r>
+        <w:rPr>
+          <w:color w:val="000000"/>
+          <w:sz w:val="32"/>
+          <w:lang w:val="es-AR"/>
+        </w:rPr>
+        <w:t xml:space="preserve">                                        </w:t>
+      </w:r>
+      <w:r>
+        <w:rPr>
+          <w:color w:val="000000"/>
+          <w:sz w:val="32"/>
+          <w:lang w:val="es-AR"/>
+        </w:rPr>
+        <w:t xml:space="preserve">        </w:t>
+      </w:r>
+      <w:r>
+        <w:rPr>
+          <w:color w:val="000000"/>
+          <w:sz w:val="32"/>
+          <w:lang w:val="es-AR"/>
+        </w:rPr>
+        <w:t xml:space="preserve">Falla </w:t>
+      </w:r>
+    </w:p>
+    <w:p>
+      <w:pPr>
+        <w:widowControl w:val="0"/>
+        <w:shd w:val="clear" w:color="auto" w:fill="FFFFFF"/>
+        <w:wordWrap w:val="0"/>
+        <w:spacing w:after="0" w:line="330" w:lineRule="exact"/>
+        <w:rPr>
+          <w:lang w:val="es-AR"/>
+        </w:rPr>
+      </w:pPr>
+      <w:r>
+        <w:rPr>
+          <w:color w:val="000000"/>
+          <w:sz w:val="32"/>
+          <w:lang w:val="es-AR"/>
+        </w:rPr>
+        <w:t xml:space="preserve">                        </w:t>
+      </w:r>
+      <w:r>
+        <w:rPr>
+          <w:color w:val="000000"/>
+          <w:sz w:val="32"/>
+          <w:lang w:val="es-AR"/>
+        </w:rPr>
+        <w:t xml:space="preserve">    </w:t>
+      </w:r>
+      <w:r>
+        <w:rPr>
+          <w:color w:val="000000"/>
+          <w:sz w:val="32"/>
+          <w:lang w:val="es-AR"/>
+        </w:rPr>
+        <w:t xml:space="preserve">-1          </w:t>
+      </w:r>
+      <w:r>
+        <w:rPr>
+          <w:color w:val="000000"/>
+          <w:sz w:val="32"/>
+          <w:lang w:val="es-AR"/>
+        </w:rPr>
+        <w:t xml:space="preserve">  </w:t>
+      </w:r>
+      <w:r>
+        <w:rPr>
+          <w:color w:val="000000"/>
+          <w:sz w:val="32"/>
+          <w:lang w:val="es-AR"/>
+        </w:rPr>
+        <w:t xml:space="preserve">   -2         </w:t>
+      </w:r>
+      <w:r>
+        <w:rPr>
+          <w:color w:val="000000"/>
+          <w:sz w:val="32"/>
+          <w:lang w:val="es-AR"/>
+        </w:rPr>
+        <w:t xml:space="preserve">  </w:t>
+      </w:r>
+      <w:r>
+        <w:rPr>
+          <w:color w:val="000000"/>
+          <w:sz w:val="32"/>
+          <w:lang w:val="es-AR"/>
+        </w:rPr>
+        <w:t xml:space="preserve">    -3        </w:t>
+      </w:r>
+      <w:r>
+        <w:rPr>
+          <w:color w:val="000000"/>
+          <w:sz w:val="32"/>
+          <w:lang w:val="es-AR"/>
+        </w:rPr>
+        <w:t xml:space="preserve">   </w:t>
+      </w:r>
+      <w:r>
+        <w:rPr>
+          <w:color w:val="000000"/>
+          <w:sz w:val="32"/>
+          <w:lang w:val="es-AR"/>
+        </w:rPr>
+        <w:t xml:space="preserve">  </w:t>
+      </w:r>
+      <w:r>
+        <w:rPr>
+          <w:color w:val="000000"/>
+          <w:sz w:val="32"/>
+          <w:lang w:val="es-AR"/>
+        </w:rPr>
+        <w:t xml:space="preserve">  </w:t>
+      </w:r>
+      <w:r>
+        <w:rPr>
+          <w:color w:val="000000"/>
+          <w:sz w:val="32"/>
+          <w:lang w:val="es-AR"/>
+        </w:rPr>
+        <w:t>integra</w:t>
+      </w:r>
+      <w:r>
+        <w:rPr>
+          <w:color w:val="000000"/>
+          <w:sz w:val="32"/>
+          <w:lang w:val="es-AR"/>
+        </w:rPr>
+        <w:t>l</w:t>
+      </w:r>
+    </w:p>
+    <w:p>
+      <w:pPr>
+        <w:widowControl w:val="0"/>
+        <w:shd w:val="clear" w:color="auto" w:fill="FFFFFF"/>
+        <w:wordWrap w:val="0"/>
+        <w:spacing w:after="0" w:line="330" w:lineRule="exact"/>
+        <w:rPr>
+          <w:lang w:val="es-AR"/>
+        </w:rPr>
+      </w:pPr>
+      <w:r>
+        <w:rPr>
+          <w:color w:val="000000"/>
+          <w:sz w:val="32"/>
+          <w:lang w:val="es-AR"/>
+        </w:rPr>
+        <w:t>Salud:\&gt;</w:t>
+      </w:r>
+      <w:r>
+        <w:rPr>
+          <w:color w:val="A6A6A6" w:themeColor="background1" w:themeShade="A6"/>
+          <w:sz w:val="32"/>
+          <w:lang w:val="es-AR"/>
+        </w:rPr>
+        <w:t>___</w:t>
+      </w:r>
+      <w:r>
+        <w:rPr>
+          <w:color w:val="000000"/>
+          <w:sz w:val="32"/>
+          <w:lang w:val="es-AR"/>
+        </w:rPr>
+        <w:t>[ ][ ][ ][ ][ ]  [</w:t>
+      </w:r>
+      <w:r>
+        <w:rPr>
+          <w:color w:val="A6A6A6" w:themeColor="background1" w:themeShade="A6"/>
+          <w:sz w:val="32"/>
+          <w:lang w:val="es-AR"/>
+        </w:rPr>
+        <w:t>*</w:t>
+      </w:r>
+      <w:r>
+        <w:rPr>
+          <w:color w:val="000000"/>
+          <w:sz w:val="32"/>
+          <w:lang w:val="es-AR"/>
+        </w:rPr>
+        <w:t>][ ][ ][ ][ ]  [</w:t>
+      </w:r>
+      <w:r>
+        <w:rPr>
+          <w:color w:val="A6A6A6" w:themeColor="background1" w:themeShade="A6"/>
+          <w:sz w:val="32"/>
+          <w:lang w:val="es-AR"/>
+        </w:rPr>
+        <w:t>*</w:t>
+      </w:r>
+      <w:r>
+        <w:rPr>
+          <w:color w:val="000000"/>
+          <w:sz w:val="32"/>
+          <w:lang w:val="es-AR"/>
+        </w:rPr>
+        <w:t>][ ][ ][ ][ ]  [</w:t>
+      </w:r>
+      <w:r>
+        <w:rPr>
+          <w:color w:val="A6A6A6" w:themeColor="background1" w:themeShade="A6"/>
+          <w:sz w:val="32"/>
+          <w:lang w:val="es-AR"/>
+        </w:rPr>
+        <w:t>*</w:t>
+      </w:r>
+      <w:r>
+        <w:rPr>
+          <w:color w:val="000000"/>
+          <w:sz w:val="32"/>
+          <w:lang w:val="es-AR"/>
+        </w:rPr>
+        <w:t>][ ][ ][ ][ ]  [</w:t>
+      </w:r>
+      <w:r>
+        <w:rPr>
+          <w:color w:val="A6A6A6" w:themeColor="background1" w:themeShade="A6"/>
+          <w:sz w:val="32"/>
+          <w:lang w:val="es-AR"/>
+        </w:rPr>
+        <w:t>*</w:t>
+      </w:r>
+      <w:r>
+        <w:rPr>
+          <w:color w:val="000000"/>
+          <w:sz w:val="32"/>
+          <w:lang w:val="es-AR"/>
+        </w:rPr>
+        <w:t xml:space="preserve">][ ][ ]  </w:t>
+      </w:r>
+    </w:p>
+    <w:p>
+      <w:pPr>
+        <w:widowControl w:val="0"/>
+        <w:shd w:val="clear" w:color="auto" w:fill="FFFFFF"/>
+        <w:wordWrap w:val="0"/>
+        <w:spacing w:after="0" w:line="330" w:lineRule="exact"/>
+        <w:rPr>
+          <w:lang w:val="es-AR"/>
+        </w:rPr>
+      </w:pPr>
+      <w:r>
+        <w:rPr>
+          <w:color w:val="000000"/>
+          <w:sz w:val="32"/>
+          <w:lang w:val="es-AR"/>
+        </w:rPr>
+        <w:t xml:space="preserve">                                                                                </w:t>
+      </w:r>
+    </w:p>
+    <w:p>
+      <w:pPr>
+        <w:widowControl w:val="0"/>
+        <w:shd w:val="clear" w:color="auto" w:fill="FFFFFF"/>
+        <w:wordWrap w:val="0"/>
+        <w:spacing w:after="0" w:line="330" w:lineRule="exact"/>
+        <w:rPr>
+          <w:color w:val="000000"/>
+          <w:sz w:val="32"/>
+          <w:lang w:val="es-AR"/>
+        </w:rPr>
+      </w:pPr>
+      <w:r>
+        <w:rPr>
+          <w:color w:val="000000"/>
+          <w:sz w:val="32"/>
+          <w:lang w:val="es-AR"/>
+        </w:rPr>
+        <w:t>[</w:t>
+      </w:r>
+      <w:r>
+        <w:rPr>
+          <w:color w:val="000000"/>
+          <w:sz w:val="32"/>
+          <w:lang w:val="es-AR"/>
+        </w:rPr>
+        <w:t xml:space="preserve">················ </w:t>
+      </w:r>
+      <w:r>
+        <w:rPr>
+          <w:color w:val="000000"/>
+          <w:sz w:val="32"/>
+          <w:lang w:val="es-AR"/>
+        </w:rPr>
+        <w:t>Cromos</w:t>
+      </w:r>
+      <w:r>
+        <w:rPr>
+          <w:color w:val="000000"/>
+          <w:sz w:val="32"/>
+          <w:lang w:val="es-AR"/>
+        </w:rPr>
+        <w:t xml:space="preserve"> ·················</w:t>
+      </w:r>
+      <w:r>
+        <w:rPr>
+          <w:color w:val="000000"/>
+          <w:sz w:val="32"/>
+          <w:lang w:val="es-AR"/>
+        </w:rPr>
+        <w:t>]  [</w:t>
+      </w:r>
+      <w:r>
+        <w:rPr>
+          <w:color w:val="000000"/>
+          <w:sz w:val="32"/>
+          <w:lang w:val="es-AR"/>
+        </w:rPr>
+        <w:t xml:space="preserve">··············· </w:t>
+      </w:r>
+      <w:r>
+        <w:rPr>
+          <w:color w:val="000000"/>
+          <w:sz w:val="32"/>
+          <w:lang w:val="es-AR"/>
+        </w:rPr>
+        <w:t>Chapería</w:t>
+      </w:r>
+      <w:r>
+        <w:rPr>
+          <w:color w:val="000000"/>
+          <w:sz w:val="32"/>
+          <w:lang w:val="es-AR"/>
+        </w:rPr>
+        <w:t xml:space="preserve"> ················</w:t>
+      </w:r>
+      <w:r>
+        <w:rPr>
+          <w:color w:val="000000"/>
+          <w:sz w:val="32"/>
+          <w:lang w:val="es-AR"/>
+        </w:rPr>
+        <w:t>]</w:t>
+      </w:r>
+    </w:p>
+    <w:p>
+      <w:pPr>
+        <w:widowControl w:val="0"/>
+        <w:shd w:val="clear" w:color="auto" w:fill="FFFFFF"/>
+        <w:wordWrap w:val="0"/>
+        <w:spacing w:after="0" w:line="330" w:lineRule="exact"/>
+        <w:rPr>
+          <w:lang w:val="es-AR"/>
+        </w:rPr>
+      </w:pPr>
+    </w:p>
+    <w:p>
+      <w:pPr>
+        <w:widowControl w:val="0"/>
+        <w:shd w:val="clear" w:color="auto" w:fill="FFFFFF"/>
+        <w:wordWrap w:val="0"/>
+        <w:spacing w:after="0" w:line="330" w:lineRule="exact"/>
+        <w:rPr>
+          <w:lang w:val="es-AR"/>
+        </w:rPr>
+      </w:pPr>
+      <w:r>
+        <w:rPr>
+          <w:color w:val="000000"/>
+          <w:sz w:val="32"/>
+          <w:lang w:val="es-AR"/>
+        </w:rPr>
+        <w:t>|</w:t>
+      </w:r>
+      <w:r>
+        <w:rPr>
+          <w:color w:val="A6A6A6" w:themeColor="background1" w:themeShade="A6"/>
+          <w:sz w:val="32"/>
+          <w:lang w:val="es-AR"/>
+        </w:rPr>
+        <w:t>_________________________________________</w:t>
+      </w:r>
+      <w:r>
+        <w:rPr>
+          <w:color w:val="000000"/>
+          <w:sz w:val="32"/>
+          <w:lang w:val="es-AR"/>
+        </w:rPr>
+        <w:t>|  |</w:t>
+      </w:r>
+      <w:r>
+        <w:rPr>
+          <w:color w:val="A6A6A6" w:themeColor="background1" w:themeShade="A6"/>
+          <w:sz w:val="32"/>
+          <w:lang w:val="es-AR"/>
+        </w:rPr>
+        <w:t>_________________________________________</w:t>
+      </w:r>
+      <w:r>
+        <w:rPr>
+          <w:color w:val="000000"/>
+          <w:sz w:val="32"/>
+          <w:lang w:val="es-AR"/>
+        </w:rPr>
+        <w:t>|</w:t>
+      </w:r>
+    </w:p>
+    <w:p>
+      <w:pPr>
+        <w:widowControl w:val="0"/>
+        <w:shd w:val="clear" w:color="auto" w:fill="FFFFFF"/>
+        <w:wordWrap w:val="0"/>
+        <w:spacing w:after="0" w:line="330" w:lineRule="exact"/>
+        <w:rPr>
+          <w:lang w:val="es-AR"/>
+        </w:rPr>
+      </w:pPr>
+      <w:r>
+        <w:rPr>
+          <w:color w:val="000000"/>
+          <w:sz w:val="32"/>
+          <w:lang w:val="es-AR"/>
+        </w:rPr>
+        <w:t>|</w:t>
+      </w:r>
+      <w:r>
+        <w:rPr>
+          <w:color w:val="A6A6A6" w:themeColor="background1" w:themeShade="A6"/>
+          <w:sz w:val="32"/>
+          <w:lang w:val="es-AR"/>
+        </w:rPr>
+        <w:t>_________________________________________</w:t>
+      </w:r>
+      <w:r>
+        <w:rPr>
+          <w:color w:val="000000"/>
+          <w:sz w:val="32"/>
+          <w:lang w:val="es-AR"/>
+        </w:rPr>
+        <w:t>|  |</w:t>
+      </w:r>
+      <w:r>
+        <w:rPr>
+          <w:color w:val="A6A6A6" w:themeColor="background1" w:themeShade="A6"/>
+          <w:sz w:val="32"/>
+          <w:lang w:val="es-AR"/>
+        </w:rPr>
+        <w:t>_________________________________________</w:t>
+      </w:r>
+      <w:r>
+        <w:rPr>
+          <w:color w:val="000000"/>
+          <w:sz w:val="32"/>
+          <w:lang w:val="es-AR"/>
+        </w:rPr>
+        <w:t>|</w:t>
+      </w:r>
+    </w:p>
+    <w:p>
+      <w:pPr>
+        <w:widowControl w:val="0"/>
+        <w:shd w:val="clear" w:color="auto" w:fill="FFFFFF"/>
+        <w:wordWrap w:val="0"/>
+        <w:spacing w:after="0" w:line="330" w:lineRule="exact"/>
+        <w:rPr>
+          <w:lang w:val="es-AR"/>
+        </w:rPr>
+      </w:pPr>
+      <w:r>
+        <w:rPr>
+          <w:color w:val="000000"/>
+          <w:sz w:val="32"/>
+          <w:lang w:val="es-AR"/>
+        </w:rPr>
+        <w:t>|</w:t>
+      </w:r>
+      <w:r>
+        <w:rPr>
+          <w:color w:val="A6A6A6" w:themeColor="background1" w:themeShade="A6"/>
+          <w:sz w:val="32"/>
+          <w:lang w:val="es-AR"/>
+        </w:rPr>
+        <w:t>_________________________________________</w:t>
+      </w:r>
+      <w:r>
+        <w:rPr>
+          <w:color w:val="000000"/>
+          <w:sz w:val="32"/>
+          <w:lang w:val="es-AR"/>
+        </w:rPr>
+        <w:t>|  |</w:t>
+      </w:r>
+      <w:r>
+        <w:rPr>
+          <w:color w:val="A6A6A6" w:themeColor="background1" w:themeShade="A6"/>
+          <w:sz w:val="32"/>
+          <w:lang w:val="es-AR"/>
+        </w:rPr>
+        <w:t>_________________________________________</w:t>
+      </w:r>
+      <w:r>
+        <w:rPr>
+          <w:color w:val="000000"/>
+          <w:sz w:val="32"/>
+          <w:lang w:val="es-AR"/>
+        </w:rPr>
+        <w:t>|</w:t>
+      </w:r>
+    </w:p>
+    <w:p>
+      <w:pPr>
+        <w:widowControl w:val="0"/>
+        <w:shd w:val="clear" w:color="auto" w:fill="FFFFFF"/>
+        <w:wordWrap w:val="0"/>
+        <w:spacing w:after="0" w:line="330" w:lineRule="exact"/>
+        <w:rPr>
+          <w:lang w:val="es-AR"/>
+        </w:rPr>
+      </w:pPr>
+      <w:r>
+        <w:rPr>
+          <w:color w:val="000000"/>
+          <w:sz w:val="32"/>
+          <w:lang w:val="es-AR"/>
+        </w:rPr>
+        <w:t>|</w:t>
+      </w:r>
+      <w:r>
+        <w:rPr>
+          <w:color w:val="A6A6A6" w:themeColor="background1" w:themeShade="A6"/>
+          <w:sz w:val="32"/>
+          <w:lang w:val="es-AR"/>
+        </w:rPr>
+        <w:t>_________________________________________</w:t>
+      </w:r>
+      <w:r>
+        <w:rPr>
+          <w:color w:val="000000"/>
+          <w:sz w:val="32"/>
+          <w:lang w:val="es-AR"/>
+        </w:rPr>
+        <w:t>|  |</w:t>
+      </w:r>
+      <w:r>
+        <w:rPr>
+          <w:color w:val="A6A6A6" w:themeColor="background1" w:themeShade="A6"/>
+          <w:sz w:val="32"/>
+          <w:lang w:val="es-AR"/>
+        </w:rPr>
+        <w:t>_________________________________________</w:t>
+      </w:r>
+      <w:r>
+        <w:rPr>
+          <w:color w:val="000000"/>
+          <w:sz w:val="32"/>
+          <w:lang w:val="es-AR"/>
+        </w:rPr>
+        <w:t>|</w:t>
+      </w:r>
+    </w:p>
+    <w:p>
+      <w:pPr>
+        <w:widowControl w:val="0"/>
+        <w:shd w:val="clear" w:color="auto" w:fill="FFFFFF"/>
+        <w:wordWrap w:val="0"/>
+        <w:spacing w:after="0" w:line="330" w:lineRule="exact"/>
+        <w:rPr>
+          <w:lang w:val="es-AR"/>
+        </w:rPr>
+      </w:pPr>
+      <w:r>
+        <w:rPr>
+          <w:color w:val="000000"/>
+          <w:sz w:val="32"/>
+          <w:lang w:val="es-AR"/>
+        </w:rPr>
+        <w:t>|</w:t>
+      </w:r>
+      <w:r>
+        <w:rPr>
+          <w:color w:val="A6A6A6" w:themeColor="background1" w:themeShade="A6"/>
+          <w:sz w:val="32"/>
+          <w:lang w:val="es-AR"/>
+        </w:rPr>
+        <w:t>_________________________________________</w:t>
+      </w:r>
+      <w:r>
+        <w:rPr>
+          <w:color w:val="000000"/>
+          <w:sz w:val="32"/>
+          <w:lang w:val="es-AR"/>
+        </w:rPr>
+        <w:t>|  |</w:t>
+      </w:r>
+      <w:r>
+        <w:rPr>
+          <w:color w:val="A6A6A6" w:themeColor="background1" w:themeShade="A6"/>
+          <w:sz w:val="32"/>
+          <w:lang w:val="es-AR"/>
+        </w:rPr>
+        <w:t>_________________________________________</w:t>
+      </w:r>
+      <w:r>
+        <w:rPr>
+          <w:color w:val="000000"/>
+          <w:sz w:val="32"/>
+          <w:lang w:val="es-AR"/>
+        </w:rPr>
+        <w:t>|</w:t>
+      </w:r>
+    </w:p>
+    <w:p>
+      <w:pPr>
+        <w:widowControl w:val="0"/>
+        <w:shd w:val="clear" w:color="auto" w:fill="FFFFFF"/>
+        <w:wordWrap w:val="0"/>
+        <w:spacing w:after="0" w:line="330" w:lineRule="exact"/>
+        <w:rPr>
+          <w:lang w:val="es-AR"/>
+        </w:rPr>
+      </w:pPr>
+      <w:r>
+        <w:rPr>
+          <w:color w:val="000000"/>
+          <w:sz w:val="32"/>
+          <w:lang w:val="es-AR"/>
+        </w:rPr>
+        <w:t>|</w:t>
+      </w:r>
+      <w:r>
+        <w:rPr>
+          <w:color w:val="A6A6A6" w:themeColor="background1" w:themeShade="A6"/>
+          <w:sz w:val="32"/>
+          <w:lang w:val="es-AR"/>
+        </w:rPr>
+        <w:t>_________________________________________</w:t>
+      </w:r>
+      <w:r>
+        <w:rPr>
+          <w:color w:val="000000"/>
+          <w:sz w:val="32"/>
+          <w:lang w:val="es-AR"/>
+        </w:rPr>
+        <w:t>|  |</w:t>
+      </w:r>
+      <w:r>
+        <w:rPr>
+          <w:color w:val="A6A6A6" w:themeColor="background1" w:themeShade="A6"/>
+          <w:sz w:val="32"/>
+          <w:lang w:val="es-AR"/>
+        </w:rPr>
+        <w:t>_________________________________________</w:t>
+      </w:r>
+      <w:r>
+        <w:rPr>
+          <w:color w:val="000000"/>
+          <w:sz w:val="32"/>
+          <w:lang w:val="es-AR"/>
+        </w:rPr>
+        <w:t>|</w:t>
+      </w:r>
+    </w:p>
+    <w:p>
+      <w:pPr>
+        <w:widowControl w:val="0"/>
+        <w:shd w:val="clear" w:color="auto" w:fill="FFFFFF"/>
+        <w:wordWrap w:val="0"/>
+        <w:spacing w:after="0" w:line="330" w:lineRule="exact"/>
+        <w:rPr>
+          <w:lang w:val="es-AR"/>
+        </w:rPr>
+      </w:pPr>
+      <w:r>
+        <w:rPr>
+          <w:color w:val="000000"/>
+          <w:sz w:val="32"/>
+          <w:lang w:val="es-AR"/>
+        </w:rPr>
+        <w:t>|</w:t>
+      </w:r>
+      <w:r>
+        <w:rPr>
+          <w:color w:val="A6A6A6" w:themeColor="background1" w:themeShade="A6"/>
+          <w:sz w:val="32"/>
+          <w:lang w:val="es-AR"/>
+        </w:rPr>
+        <w:t>_________________________________________</w:t>
+      </w:r>
+      <w:r>
+        <w:rPr>
+          <w:color w:val="000000"/>
+          <w:sz w:val="32"/>
+          <w:lang w:val="es-AR"/>
+        </w:rPr>
+        <w:t>|  |</w:t>
+      </w:r>
+      <w:r>
+        <w:rPr>
+          <w:color w:val="A6A6A6" w:themeColor="background1" w:themeShade="A6"/>
+          <w:sz w:val="32"/>
+          <w:lang w:val="es-AR"/>
+        </w:rPr>
+        <w:t>_________________________________________</w:t>
+      </w:r>
+      <w:r>
+        <w:rPr>
+          <w:color w:val="000000"/>
+          <w:sz w:val="32"/>
+          <w:lang w:val="es-AR"/>
+        </w:rPr>
+        <w:t>|</w:t>
+      </w:r>
+    </w:p>
+    <w:p>
+      <w:pPr>
+        <w:widowControl w:val="0"/>
+        <w:shd w:val="clear" w:color="auto" w:fill="FFFFFF"/>
+        <w:wordWrap w:val="0"/>
+        <w:spacing w:after="0" w:line="330" w:lineRule="exact"/>
+        <w:rPr>
+          <w:lang w:val="es-AR"/>
+        </w:rPr>
+      </w:pPr>
+      <w:r>
+        <w:rPr>
+          <w:color w:val="000000"/>
+          <w:sz w:val="32"/>
+          <w:lang w:val="es-AR"/>
+        </w:rPr>
+        <w:t>|</w:t>
+      </w:r>
+      <w:r>
+        <w:rPr>
+          <w:color w:val="A6A6A6" w:themeColor="background1" w:themeShade="A6"/>
+          <w:sz w:val="32"/>
+          <w:lang w:val="es-AR"/>
+        </w:rPr>
+        <w:t>_________________________________________</w:t>
+      </w:r>
+      <w:r>
+        <w:rPr>
+          <w:color w:val="000000"/>
+          <w:sz w:val="32"/>
+          <w:lang w:val="es-AR"/>
+        </w:rPr>
+        <w:t>|  |</w:t>
+      </w:r>
+      <w:r>
+        <w:rPr>
+          <w:color w:val="A6A6A6" w:themeColor="background1" w:themeShade="A6"/>
+          <w:sz w:val="32"/>
+          <w:lang w:val="es-AR"/>
+        </w:rPr>
+        <w:t>_________________________________________</w:t>
+      </w:r>
+      <w:r>
+        <w:rPr>
+          <w:color w:val="000000"/>
+          <w:sz w:val="32"/>
+          <w:lang w:val="es-AR"/>
+        </w:rPr>
+        <w:t>|</w:t>
+      </w:r>
+    </w:p>
+    <w:p>
+      <w:pPr>
+        <w:widowControl w:val="0"/>
+        <w:shd w:val="clear" w:color="auto" w:fill="FFFFFF"/>
+        <w:wordWrap w:val="0"/>
+        <w:spacing w:after="0" w:line="330" w:lineRule="exact"/>
+        <w:rPr>
+          <w:lang w:val="es-AR"/>
+        </w:rPr>
+      </w:pPr>
+      <w:r>
+        <w:rPr>
+          <w:color w:val="000000"/>
+          <w:sz w:val="32"/>
+          <w:lang w:val="es-AR"/>
+        </w:rPr>
+        <w:t>|</w:t>
+      </w:r>
+      <w:r>
+        <w:rPr>
+          <w:color w:val="A6A6A6" w:themeColor="background1" w:themeShade="A6"/>
+          <w:sz w:val="32"/>
+          <w:lang w:val="es-AR"/>
+        </w:rPr>
+        <w:t>_________________________________________</w:t>
+      </w:r>
+      <w:r>
+        <w:rPr>
+          <w:color w:val="000000"/>
+          <w:sz w:val="32"/>
+          <w:lang w:val="es-AR"/>
+        </w:rPr>
+        <w:t>|  |</w:t>
+      </w:r>
+      <w:r>
+        <w:rPr>
+          <w:color w:val="A6A6A6" w:themeColor="background1" w:themeShade="A6"/>
+          <w:sz w:val="32"/>
+          <w:lang w:val="es-AR"/>
+        </w:rPr>
+        <w:t>_________________________________________</w:t>
+      </w:r>
+      <w:r>
+        <w:rPr>
+          <w:color w:val="000000"/>
+          <w:sz w:val="32"/>
+          <w:lang w:val="es-AR"/>
+        </w:rPr>
+        <w:t>|</w:t>
+      </w:r>
+    </w:p>
+    <w:p>
+      <w:pPr>
+        <w:widowControl w:val="0"/>
+        <w:shd w:val="clear" w:color="auto" w:fill="FFFFFF"/>
+        <w:wordWrap w:val="0"/>
+        <w:spacing w:after="0" w:line="330" w:lineRule="exact"/>
+        <w:rPr>
+          <w:lang w:val="es-AR"/>
+        </w:rPr>
+      </w:pPr>
+      <w:r>
+        <w:rPr>
+          <w:color w:val="000000"/>
+          <w:sz w:val="32"/>
+          <w:lang w:val="es-AR"/>
+        </w:rPr>
+        <w:t>|</w:t>
+      </w:r>
+      <w:r>
+        <w:rPr>
+          <w:color w:val="A6A6A6" w:themeColor="background1" w:themeShade="A6"/>
+          <w:sz w:val="32"/>
+          <w:lang w:val="es-AR"/>
+        </w:rPr>
+        <w:t>_________________________________________</w:t>
+      </w:r>
+      <w:r>
+        <w:rPr>
+          <w:color w:val="000000"/>
+          <w:sz w:val="32"/>
+          <w:lang w:val="es-AR"/>
+        </w:rPr>
+        <w:t>|  |</w:t>
+      </w:r>
+      <w:r>
+        <w:rPr>
+          <w:color w:val="A6A6A6" w:themeColor="background1" w:themeShade="A6"/>
+          <w:sz w:val="32"/>
+          <w:lang w:val="es-AR"/>
+        </w:rPr>
+        <w:t>_________________________________________</w:t>
+      </w:r>
+      <w:r>
+        <w:rPr>
+          <w:color w:val="000000"/>
+          <w:sz w:val="32"/>
+          <w:lang w:val="es-AR"/>
+        </w:rPr>
+        <w:t>|</w:t>
+      </w:r>
+    </w:p>
+    <w:p>
+      <w:pPr>
+        <w:widowControl w:val="0"/>
+        <w:shd w:val="clear" w:color="auto" w:fill="FFFFFF"/>
+        <w:wordWrap w:val="0"/>
+        <w:spacing w:after="0" w:line="330" w:lineRule="exact"/>
+        <w:rPr>
+          <w:lang w:val="es-AR"/>
+        </w:rPr>
+      </w:pPr>
+      <w:r>
+        <w:rPr>
+          <w:color w:val="000000"/>
+          <w:sz w:val="32"/>
+          <w:lang w:val="es-AR"/>
+        </w:rPr>
+        <w:t>|</w:t>
+      </w:r>
+      <w:r>
+        <w:rPr>
+          <w:color w:val="A6A6A6" w:themeColor="background1" w:themeShade="A6"/>
+          <w:sz w:val="32"/>
+          <w:lang w:val="es-AR"/>
+        </w:rPr>
+        <w:t>_________________________________________</w:t>
+      </w:r>
+      <w:r>
+        <w:rPr>
+          <w:color w:val="000000"/>
+          <w:sz w:val="32"/>
+          <w:lang w:val="es-AR"/>
+        </w:rPr>
+        <w:t>|  |</w:t>
+      </w:r>
+      <w:r>
+        <w:rPr>
+          <w:color w:val="A6A6A6" w:themeColor="background1" w:themeShade="A6"/>
+          <w:sz w:val="32"/>
+          <w:lang w:val="es-AR"/>
+        </w:rPr>
+        <w:t>_________________________________________</w:t>
+      </w:r>
+      <w:r>
+        <w:rPr>
+          <w:color w:val="000000"/>
+          <w:sz w:val="32"/>
+          <w:lang w:val="es-AR"/>
+        </w:rPr>
+        <w:t>|</w:t>
+      </w:r>
+    </w:p>
+    <w:p>
+      <w:pPr>
+        <w:widowControl w:val="0"/>
+        <w:shd w:val="clear" w:color="auto" w:fill="FFFFFF"/>
+        <w:wordWrap w:val="0"/>
+        <w:spacing w:after="0" w:line="330" w:lineRule="exact"/>
+        <w:rPr>
+          <w:lang w:val="es-AR"/>
+        </w:rPr>
+      </w:pPr>
+      <w:r>
+        <w:rPr>
+          <w:color w:val="000000"/>
+          <w:sz w:val="32"/>
+          <w:lang w:val="es-AR"/>
+        </w:rPr>
+        <w:t>|</w:t>
+      </w:r>
+      <w:r>
+        <w:rPr>
+          <w:color w:val="A6A6A6" w:themeColor="background1" w:themeShade="A6"/>
+          <w:sz w:val="32"/>
+          <w:lang w:val="es-AR"/>
+        </w:rPr>
+        <w:t>_________________________________________</w:t>
+      </w:r>
+      <w:r>
+        <w:rPr>
+          <w:color w:val="000000"/>
+          <w:sz w:val="32"/>
+          <w:lang w:val="es-AR"/>
+        </w:rPr>
+        <w:t>|  |</w:t>
+      </w:r>
+      <w:r>
+        <w:rPr>
+          <w:color w:val="A6A6A6" w:themeColor="background1" w:themeShade="A6"/>
+          <w:sz w:val="32"/>
+          <w:lang w:val="es-AR"/>
+        </w:rPr>
+        <w:t>_________________________________________</w:t>
+      </w:r>
+      <w:r>
+        <w:rPr>
+          <w:color w:val="000000"/>
+          <w:sz w:val="32"/>
+          <w:lang w:val="es-AR"/>
+        </w:rPr>
+        <w:t>|</w:t>
+      </w:r>
+    </w:p>
+    <w:p>
+      <w:pPr>
+        <w:widowControl w:val="0"/>
+        <w:shd w:val="clear" w:color="auto" w:fill="FFFFFF"/>
+        <w:wordWrap w:val="0"/>
+        <w:spacing w:after="0" w:line="330" w:lineRule="exact"/>
+        <w:rPr>
+          <w:lang w:val="es-AR"/>
+        </w:rPr>
+      </w:pPr>
+      <w:r>
+        <w:rPr>
+          <w:color w:val="000000"/>
+          <w:sz w:val="32"/>
+          <w:lang w:val="es-AR"/>
+        </w:rPr>
+        <w:t>|</w:t>
+      </w:r>
+      <w:r>
+        <w:rPr>
+          <w:color w:val="A6A6A6" w:themeColor="background1" w:themeShade="A6"/>
+          <w:sz w:val="32"/>
+          <w:lang w:val="es-AR"/>
+        </w:rPr>
+        <w:t>_________________________________________</w:t>
+      </w:r>
+      <w:r>
+        <w:rPr>
+          <w:color w:val="000000"/>
+          <w:sz w:val="32"/>
+          <w:lang w:val="es-AR"/>
+        </w:rPr>
+        <w:t>|  |</w:t>
+      </w:r>
+      <w:r>
+        <w:rPr>
+          <w:color w:val="A6A6A6" w:themeColor="background1" w:themeShade="A6"/>
+          <w:sz w:val="32"/>
+          <w:lang w:val="es-AR"/>
+        </w:rPr>
+        <w:t>_________________________________________</w:t>
+      </w:r>
+      <w:r>
+        <w:rPr>
+          <w:color w:val="000000"/>
+          <w:sz w:val="32"/>
+          <w:lang w:val="es-AR"/>
+        </w:rPr>
+        <w:t>|</w:t>
+      </w:r>
+    </w:p>
+    <w:p>
+      <w:pPr>
+        <w:widowControl w:val="0"/>
+        <w:shd w:val="clear" w:color="auto" w:fill="FFFFFF"/>
+        <w:wordWrap w:val="0"/>
+        <w:spacing w:after="0" w:line="330" w:lineRule="exact"/>
+        <w:rPr>
+          <w:lang w:val="es-AR"/>
+        </w:rPr>
+      </w:pPr>
+      <w:r>
+        <w:rPr>
+          <w:color w:val="000000"/>
+          <w:sz w:val="32"/>
+          <w:lang w:val="es-AR"/>
+        </w:rPr>
+        <w:t>|</w:t>
+      </w:r>
+      <w:r>
+        <w:rPr>
+          <w:color w:val="A6A6A6" w:themeColor="background1" w:themeShade="A6"/>
+          <w:sz w:val="32"/>
+          <w:lang w:val="es-AR"/>
+        </w:rPr>
+        <w:t>_________________________________________</w:t>
+      </w:r>
+      <w:r>
+        <w:rPr>
+          <w:color w:val="000000"/>
+          <w:sz w:val="32"/>
+          <w:lang w:val="es-AR"/>
+        </w:rPr>
+        <w:t>|  |</w:t>
+      </w:r>
+      <w:r>
+        <w:rPr>
+          <w:color w:val="A6A6A6" w:themeColor="background1" w:themeShade="A6"/>
+          <w:sz w:val="32"/>
+          <w:lang w:val="es-AR"/>
+        </w:rPr>
+        <w:t>_________________________________________</w:t>
+      </w:r>
+      <w:r>
+        <w:rPr>
+          <w:color w:val="000000"/>
+          <w:sz w:val="32"/>
+          <w:lang w:val="es-AR"/>
+        </w:rPr>
+        <w:t>|</w:t>
+      </w:r>
+    </w:p>
+    <w:p>
+      <w:pPr>
+        <w:widowControl w:val="0"/>
+        <w:shd w:val="clear" w:color="auto" w:fill="FFFFFF"/>
+        <w:wordWrap w:val="0"/>
+        <w:spacing w:after="0" w:line="330" w:lineRule="exact"/>
+        <w:rPr>
+          <w:lang w:val="es-AR"/>
+        </w:rPr>
+      </w:pPr>
+      <w:r>
+        <w:rPr>
+          <w:color w:val="000000"/>
+          <w:sz w:val="32"/>
+          <w:lang w:val="es-AR"/>
+        </w:rPr>
+        <w:t>|</w:t>
+      </w:r>
+      <w:r>
+        <w:rPr>
+          <w:color w:val="A6A6A6" w:themeColor="background1" w:themeShade="A6"/>
+          <w:sz w:val="32"/>
+          <w:lang w:val="es-AR"/>
+        </w:rPr>
+        <w:t>_________________________________________</w:t>
+      </w:r>
+      <w:r>
+        <w:rPr>
+          <w:color w:val="000000"/>
+          <w:sz w:val="32"/>
+          <w:lang w:val="es-AR"/>
+        </w:rPr>
+        <w:t>|  |</w:t>
+      </w:r>
+      <w:r>
+        <w:rPr>
+          <w:color w:val="A6A6A6" w:themeColor="background1" w:themeShade="A6"/>
+          <w:sz w:val="32"/>
+          <w:lang w:val="es-AR"/>
+        </w:rPr>
+        <w:t>_________________________________________</w:t>
+      </w:r>
+      <w:r>
+        <w:rPr>
+          <w:color w:val="000000"/>
+          <w:sz w:val="32"/>
+          <w:lang w:val="es-AR"/>
+        </w:rPr>
+        <w:t>|</w:t>
+      </w:r>
+    </w:p>
+    <w:p>
+      <w:pPr>
+        <w:widowControl w:val="0"/>
+        <w:shd w:val="clear" w:color="auto" w:fill="FFFFFF"/>
+        <w:wordWrap w:val="0"/>
+        <w:spacing w:after="0" w:line="330" w:lineRule="exact"/>
+        <w:rPr>
+          <w:lang w:val="es-AR"/>
+        </w:rPr>
+      </w:pPr>
+      <w:r>
+        <w:rPr>
+          <w:color w:val="000000"/>
+          <w:sz w:val="32"/>
+          <w:lang w:val="es-AR"/>
+        </w:rPr>
+        <w:t>|</w:t>
+      </w:r>
+      <w:r>
+        <w:rPr>
+          <w:color w:val="A6A6A6" w:themeColor="background1" w:themeShade="A6"/>
+          <w:sz w:val="32"/>
+          <w:lang w:val="es-AR"/>
+        </w:rPr>
+        <w:t>_________________________________________</w:t>
+      </w:r>
+      <w:r>
+        <w:rPr>
+          <w:color w:val="000000"/>
+          <w:sz w:val="32"/>
+          <w:lang w:val="es-AR"/>
+        </w:rPr>
+        <w:t>|  |</w:t>
+      </w:r>
+      <w:r>
+        <w:rPr>
+          <w:color w:val="A6A6A6" w:themeColor="background1" w:themeShade="A6"/>
+          <w:sz w:val="32"/>
+          <w:lang w:val="es-AR"/>
+        </w:rPr>
+        <w:t>_________________________________________</w:t>
+      </w:r>
+      <w:r>
+        <w:rPr>
+          <w:color w:val="000000"/>
+          <w:sz w:val="32"/>
+          <w:lang w:val="es-AR"/>
+        </w:rPr>
+        <w:t>|</w:t>
+      </w:r>
+    </w:p>
+    <w:p>
+      <w:pPr>
+        <w:widowControl w:val="0"/>
+        <w:shd w:val="clear" w:color="auto" w:fill="FFFFFF"/>
+        <w:wordWrap w:val="0"/>
+        <w:spacing w:after="0" w:line="330" w:lineRule="exact"/>
+        <w:rPr>
+          <w:lang w:val="es-AR"/>
+        </w:rPr>
+      </w:pPr>
+      <w:r>
+        <w:rPr>
+          <w:color w:val="000000"/>
+          <w:sz w:val="32"/>
+          <w:lang w:val="es-AR"/>
+        </w:rPr>
+        <w:t>|</w:t>
+      </w:r>
+      <w:r>
+        <w:rPr>
+          <w:color w:val="A6A6A6" w:themeColor="background1" w:themeShade="A6"/>
+          <w:sz w:val="32"/>
+          <w:lang w:val="es-AR"/>
+        </w:rPr>
+        <w:t>_________________________________________</w:t>
+      </w:r>
+      <w:r>
+        <w:rPr>
+          <w:color w:val="000000"/>
+          <w:sz w:val="32"/>
+          <w:lang w:val="es-AR"/>
+        </w:rPr>
+        <w:t>|  |</w:t>
+      </w:r>
+      <w:r>
+        <w:rPr>
+          <w:color w:val="A6A6A6" w:themeColor="background1" w:themeShade="A6"/>
+          <w:sz w:val="32"/>
+          <w:lang w:val="es-AR"/>
+        </w:rPr>
+        <w:t>_________________________________________</w:t>
+      </w:r>
+      <w:r>
+        <w:rPr>
+          <w:color w:val="000000"/>
+          <w:sz w:val="32"/>
+          <w:lang w:val="es-AR"/>
+        </w:rPr>
+        <w:t>|</w:t>
+      </w:r>
+    </w:p>
+    <w:p>
+      <w:pPr>
+        <w:widowControl w:val="0"/>
+        <w:shd w:val="clear" w:color="auto" w:fill="FFFFFF"/>
+        <w:wordWrap w:val="0"/>
+        <w:spacing w:after="0" w:line="330" w:lineRule="exact"/>
+        <w:rPr>
+          <w:lang w:val="es-AR"/>
+        </w:rPr>
+      </w:pPr>
+      <w:r>
+        <w:rPr>
+          <w:color w:val="000000"/>
+          <w:sz w:val="32"/>
+          <w:lang w:val="es-AR"/>
+        </w:rPr>
+        <w:t>|</w:t>
+      </w:r>
+      <w:r>
+        <w:rPr>
+          <w:color w:val="A6A6A6" w:themeColor="background1" w:themeShade="A6"/>
+          <w:sz w:val="32"/>
+          <w:lang w:val="es-AR"/>
+        </w:rPr>
+        <w:t>_________________________________________</w:t>
+      </w:r>
+      <w:r>
+        <w:rPr>
+          <w:color w:val="000000"/>
+          <w:sz w:val="32"/>
+          <w:lang w:val="es-AR"/>
+        </w:rPr>
+        <w:t>|  |</w:t>
+      </w:r>
+      <w:r>
+        <w:rPr>
+          <w:color w:val="A6A6A6" w:themeColor="background1" w:themeShade="A6"/>
+          <w:sz w:val="32"/>
+          <w:lang w:val="es-AR"/>
+        </w:rPr>
+        <w:t>_________________________________________</w:t>
+      </w:r>
+      <w:r>
+        <w:rPr>
+          <w:color w:val="000000"/>
+          <w:sz w:val="32"/>
+          <w:lang w:val="es-AR"/>
+        </w:rPr>
+        <w:t>|</w:t>
+      </w:r>
+    </w:p>
+    <w:p>
+      <w:pPr>
+        <w:widowControl w:val="0"/>
+        <w:shd w:val="clear" w:color="auto" w:fill="FFFFFF"/>
+        <w:wordWrap w:val="0"/>
+        <w:spacing w:after="0" w:line="330" w:lineRule="exact"/>
+        <w:rPr>
+          <w:lang w:val="es-AR"/>
+        </w:rPr>
+      </w:pPr>
+      <w:r>
+        <w:rPr>
+          <w:color w:val="000000"/>
+          <w:sz w:val="32"/>
+          <w:lang w:val="es-AR"/>
+        </w:rPr>
+        <w:t>|</w:t>
+      </w:r>
+      <w:r>
+        <w:rPr>
+          <w:color w:val="A6A6A6" w:themeColor="background1" w:themeShade="A6"/>
+          <w:sz w:val="32"/>
+          <w:lang w:val="es-AR"/>
+        </w:rPr>
+        <w:t>_________________________________________</w:t>
+      </w:r>
+      <w:r>
+        <w:rPr>
+          <w:color w:val="000000"/>
+          <w:sz w:val="32"/>
+          <w:lang w:val="es-AR"/>
+        </w:rPr>
+        <w:t>|  |</w:t>
+      </w:r>
+      <w:r>
+        <w:rPr>
+          <w:color w:val="A6A6A6" w:themeColor="background1" w:themeShade="A6"/>
+          <w:sz w:val="32"/>
+          <w:lang w:val="es-AR"/>
+        </w:rPr>
+        <w:t>_________________________________________</w:t>
+      </w:r>
+      <w:r>
+        <w:rPr>
+          <w:color w:val="000000"/>
+          <w:sz w:val="32"/>
+          <w:lang w:val="es-AR"/>
+        </w:rPr>
+        <w:t>|</w:t>
+      </w:r>
+    </w:p>
+    <w:p>
+      <w:pPr>
+        <w:widowControl w:val="0"/>
+        <w:shd w:val="clear" w:color="auto" w:fill="FFFFFF"/>
+        <w:wordWrap w:val="0"/>
+        <w:spacing w:after="0" w:line="330" w:lineRule="exact"/>
+        <w:rPr>
+          <w:lang w:val="es-AR"/>
+        </w:rPr>
+      </w:pPr>
+      <w:r>
+        <w:rPr>
+          <w:color w:val="000000"/>
+          <w:sz w:val="32"/>
+          <w:lang w:val="es-AR"/>
+        </w:rPr>
+        <w:t>|</w:t>
+      </w:r>
+      <w:r>
+        <w:rPr>
+          <w:color w:val="A6A6A6" w:themeColor="background1" w:themeShade="A6"/>
+          <w:sz w:val="32"/>
+          <w:lang w:val="es-AR"/>
+        </w:rPr>
+        <w:t>_________________________________________</w:t>
+      </w:r>
+      <w:r>
+        <w:rPr>
+          <w:color w:val="000000"/>
+          <w:sz w:val="32"/>
+          <w:lang w:val="es-AR"/>
+        </w:rPr>
+        <w:t>|  |</w:t>
+      </w:r>
+      <w:r>
+        <w:rPr>
+          <w:color w:val="A6A6A6" w:themeColor="background1" w:themeShade="A6"/>
+          <w:sz w:val="32"/>
+          <w:lang w:val="es-AR"/>
+        </w:rPr>
+        <w:t>_________________________________________</w:t>
+      </w:r>
+      <w:r>
+        <w:rPr>
+          <w:color w:val="000000"/>
+          <w:sz w:val="32"/>
+          <w:lang w:val="es-AR"/>
+        </w:rPr>
+        <w:t>|</w:t>
+      </w:r>
+    </w:p>
+    <w:p>
+      <w:pPr>
+        <w:widowControl w:val="0"/>
+        <w:shd w:val="clear" w:color="auto" w:fill="FFFFFF"/>
+        <w:wordWrap w:val="0"/>
+        <w:spacing w:after="0" w:line="330" w:lineRule="exact"/>
+        <w:rPr>
+          <w:lang w:val="es-AR"/>
+        </w:rPr>
+      </w:pPr>
+      <w:r>
+        <w:rPr>
+          <w:color w:val="000000"/>
+          <w:sz w:val="32"/>
+          <w:lang w:val="es-AR"/>
+        </w:rPr>
+        <w:t>|</w:t>
+      </w:r>
+      <w:r>
+        <w:rPr>
+          <w:color w:val="A6A6A6" w:themeColor="background1" w:themeShade="A6"/>
+          <w:sz w:val="32"/>
+          <w:lang w:val="es-AR"/>
+        </w:rPr>
+        <w:t>_________________________________________</w:t>
+      </w:r>
+      <w:r>
+        <w:rPr>
+          <w:color w:val="000000"/>
+          <w:sz w:val="32"/>
+          <w:lang w:val="es-AR"/>
+        </w:rPr>
+        <w:t>|  |</w:t>
+      </w:r>
+      <w:r>
+        <w:rPr>
+          <w:color w:val="A6A6A6" w:themeColor="background1" w:themeShade="A6"/>
+          <w:sz w:val="32"/>
+          <w:lang w:val="es-AR"/>
+        </w:rPr>
+        <w:t>_________________________________________</w:t>
+      </w:r>
+      <w:r>
+        <w:rPr>
+          <w:color w:val="000000"/>
+          <w:sz w:val="32"/>
+          <w:lang w:val="es-AR"/>
+        </w:rPr>
+        <w:t>|</w:t>
+      </w:r>
+    </w:p>
+    <w:p>
+      <w:pPr>
+        <w:widowControl w:val="0"/>
+        <w:shd w:val="clear" w:color="auto" w:fill="FFFFFF"/>
+        <w:wordWrap w:val="0"/>
+        <w:spacing w:after="0" w:line="330" w:lineRule="exact"/>
+        <w:rPr>
+          <w:lang w:val="es-AR"/>
+        </w:rPr>
+      </w:pPr>
+      <w:r>
+        <w:rPr>
+          <w:color w:val="000000"/>
+          <w:sz w:val="32"/>
+          <w:lang w:val="es-AR"/>
+        </w:rPr>
+        <w:t>|</w:t>
+      </w:r>
+      <w:r>
+        <w:rPr>
+          <w:color w:val="A6A6A6" w:themeColor="background1" w:themeShade="A6"/>
+          <w:sz w:val="32"/>
+          <w:lang w:val="es-AR"/>
+        </w:rPr>
+        <w:t>_________________________________________</w:t>
+      </w:r>
+      <w:r>
+        <w:rPr>
+          <w:color w:val="000000"/>
+          <w:sz w:val="32"/>
+          <w:lang w:val="es-AR"/>
+        </w:rPr>
+        <w:t>|  |</w:t>
+      </w:r>
+      <w:r>
+        <w:rPr>
+          <w:color w:val="A6A6A6" w:themeColor="background1" w:themeShade="A6"/>
+          <w:sz w:val="32"/>
+          <w:lang w:val="es-AR"/>
+        </w:rPr>
+        <w:t>_________________________________________</w:t>
+      </w:r>
+      <w:r>
+        <w:rPr>
+          <w:color w:val="000000"/>
+          <w:sz w:val="32"/>
+          <w:lang w:val="es-AR"/>
+        </w:rPr>
+        <w:t>|</w:t>
+      </w:r>
+    </w:p>
+    <w:p>
+      <w:pPr>
+        <w:widowControl w:val="0"/>
+        <w:shd w:val="clear" w:color="auto" w:fill="FFFFFF"/>
+        <w:wordWrap w:val="0"/>
+        <w:spacing w:after="0" w:line="330" w:lineRule="exact"/>
+        <w:rPr>
+          <w:lang w:val="es-AR"/>
+        </w:rPr>
+      </w:pPr>
+      <w:r>
+        <w:rPr>
+          <w:color w:val="000000"/>
+          <w:sz w:val="32"/>
+          <w:lang w:val="es-AR"/>
+        </w:rPr>
+        <w:t>|</w:t>
+      </w:r>
+      <w:r>
+        <w:rPr>
+          <w:color w:val="A6A6A6" w:themeColor="background1" w:themeShade="A6"/>
+          <w:sz w:val="32"/>
+          <w:lang w:val="es-AR"/>
+        </w:rPr>
+        <w:t>_________________________________________</w:t>
+      </w:r>
+      <w:r>
+        <w:rPr>
+          <w:color w:val="000000"/>
+          <w:sz w:val="32"/>
+          <w:lang w:val="es-AR"/>
+        </w:rPr>
+        <w:t>|  |</w:t>
+      </w:r>
+      <w:r>
+        <w:rPr>
+          <w:color w:val="A6A6A6" w:themeColor="background1" w:themeShade="A6"/>
+          <w:sz w:val="32"/>
+          <w:lang w:val="es-AR"/>
+        </w:rPr>
+        <w:t>_________________________________________</w:t>
+      </w:r>
+      <w:r>
+        <w:rPr>
+          <w:color w:val="000000"/>
+          <w:sz w:val="32"/>
+          <w:lang w:val="es-AR"/>
+        </w:rPr>
+        <w:t>|</w:t>
+      </w:r>
+    </w:p>
+    <w:p>
+      <w:pPr>
+        <w:widowControl w:val="0"/>
+        <w:shd w:val="clear" w:color="auto" w:fill="FFFFFF"/>
+        <w:wordWrap w:val="0"/>
+        <w:spacing w:after="0" w:line="330" w:lineRule="exact"/>
+        <w:rPr>
+          <w:lang w:val="es-AR"/>
+        </w:rPr>
+      </w:pPr>
+      <w:r>
+        <w:rPr>
+          <w:color w:val="000000"/>
+          <w:sz w:val="32"/>
+          <w:lang w:val="es-AR"/>
+        </w:rPr>
+        <w:t>|</w:t>
+      </w:r>
+      <w:r>
+        <w:rPr>
+          <w:color w:val="A6A6A6" w:themeColor="background1" w:themeShade="A6"/>
+          <w:sz w:val="32"/>
+          <w:lang w:val="es-AR"/>
+        </w:rPr>
+        <w:t>_________________________________________</w:t>
+      </w:r>
+      <w:r>
+        <w:rPr>
+          <w:color w:val="000000"/>
+          <w:sz w:val="32"/>
+          <w:lang w:val="es-AR"/>
+        </w:rPr>
+        <w:t>|  |</w:t>
+      </w:r>
+      <w:r>
+        <w:rPr>
+          <w:color w:val="A6A6A6" w:themeColor="background1" w:themeShade="A6"/>
+          <w:sz w:val="32"/>
+          <w:lang w:val="es-AR"/>
+        </w:rPr>
+        <w:t>_________________________________________</w:t>
+      </w:r>
+      <w:r>
+        <w:rPr>
+          <w:color w:val="000000"/>
+          <w:sz w:val="32"/>
+          <w:lang w:val="es-AR"/>
+        </w:rPr>
+        <w:t>|</w:t>
+      </w:r>
+    </w:p>
+    <w:p>
+      <w:pPr>
+        <w:widowControl w:val="0"/>
+        <w:shd w:val="clear" w:color="auto" w:fill="FFFFFF"/>
+        <w:wordWrap w:val="0"/>
+        <w:spacing w:after="0" w:line="330" w:lineRule="exact"/>
+        <w:rPr>
+          <w:lang w:val="es-AR"/>
+        </w:rPr>
+      </w:pPr>
+      <w:r>
+        <w:rPr>
+          <w:color w:val="000000"/>
+          <w:sz w:val="32"/>
+          <w:lang w:val="es-AR"/>
+        </w:rPr>
+        <w:t>|</w:t>
+      </w:r>
+      <w:r>
+        <w:rPr>
+          <w:color w:val="A6A6A6" w:themeColor="background1" w:themeShade="A6"/>
+          <w:sz w:val="32"/>
+          <w:lang w:val="es-AR"/>
+        </w:rPr>
+        <w:t>_________________________________________</w:t>
+      </w:r>
+      <w:r>
+        <w:rPr>
+          <w:color w:val="000000"/>
+          <w:sz w:val="32"/>
+          <w:lang w:val="es-AR"/>
+        </w:rPr>
+        <w:t>|  |</w:t>
+      </w:r>
+      <w:r>
+        <w:rPr>
+          <w:color w:val="A6A6A6" w:themeColor="background1" w:themeShade="A6"/>
+          <w:sz w:val="32"/>
+          <w:lang w:val="es-AR"/>
+        </w:rPr>
+        <w:t>_________________________________________</w:t>
+      </w:r>
+      <w:r>
+        <w:rPr>
+          <w:color w:val="000000"/>
+          <w:sz w:val="32"/>
+          <w:lang w:val="es-AR"/>
+        </w:rPr>
+        <w:t>|</w:t>
+      </w:r>
+    </w:p>
+    <w:p>
+      <w:pPr>
+        <w:widowControl w:val="0"/>
+        <w:shd w:val="clear" w:color="auto" w:fill="FFFFFF"/>
+        <w:wordWrap w:val="0"/>
+        <w:spacing w:after="0" w:line="330" w:lineRule="exact"/>
+        <w:rPr>
+          <w:lang w:val="es-AR"/>
+        </w:rPr>
+      </w:pPr>
+      <w:r>
+        <w:rPr>
+          <w:color w:val="000000"/>
+          <w:sz w:val="32"/>
+          <w:lang w:val="es-AR"/>
+        </w:rPr>
+        <w:t>|</w:t>
+      </w:r>
+      <w:r>
+        <w:rPr>
+          <w:color w:val="A6A6A6" w:themeColor="background1" w:themeShade="A6"/>
+          <w:sz w:val="32"/>
+          <w:lang w:val="es-AR"/>
+        </w:rPr>
+        <w:t>_________________________________________</w:t>
+      </w:r>
+      <w:r>
+        <w:rPr>
+          <w:color w:val="000000"/>
+          <w:sz w:val="32"/>
+          <w:lang w:val="es-AR"/>
+        </w:rPr>
+        <w:t>|  |</w:t>
+      </w:r>
+      <w:r>
+        <w:rPr>
+          <w:color w:val="A6A6A6" w:themeColor="background1" w:themeShade="A6"/>
+          <w:sz w:val="32"/>
+          <w:lang w:val="es-AR"/>
+        </w:rPr>
+        <w:t>_________________________________________</w:t>
+      </w:r>
+      <w:r>
+        <w:rPr>
+          <w:color w:val="000000"/>
+          <w:sz w:val="32"/>
+          <w:lang w:val="es-AR"/>
+        </w:rPr>
+        <w:t>|</w:t>
+      </w:r>
+    </w:p>
+    <w:p>
+      <w:pPr>
+        <w:widowControl w:val="0"/>
+        <w:shd w:val="clear" w:color="auto" w:fill="FFFFFF"/>
+        <w:wordWrap w:val="0"/>
+        <w:spacing w:after="0" w:line="330" w:lineRule="exact"/>
+        <w:rPr>
+          <w:lang w:val="es-AR"/>
+        </w:rPr>
+      </w:pPr>
+      <w:r>
+        <w:rPr>
+          <w:color w:val="000000"/>
+          <w:sz w:val="32"/>
+          <w:lang w:val="es-AR"/>
+        </w:rPr>
+        <w:t>|</w:t>
+      </w:r>
+      <w:r>
+        <w:rPr>
+          <w:color w:val="A6A6A6" w:themeColor="background1" w:themeShade="A6"/>
+          <w:sz w:val="32"/>
+          <w:lang w:val="es-AR"/>
+        </w:rPr>
+        <w:t>_________________________________________</w:t>
+      </w:r>
+      <w:r>
+        <w:rPr>
+          <w:color w:val="000000"/>
+          <w:sz w:val="32"/>
+          <w:lang w:val="es-AR"/>
+        </w:rPr>
+        <w:t>|  |</w:t>
+      </w:r>
+      <w:r>
+        <w:rPr>
+          <w:color w:val="A6A6A6" w:themeColor="background1" w:themeShade="A6"/>
+          <w:sz w:val="32"/>
+          <w:lang w:val="es-AR"/>
+        </w:rPr>
+        <w:t>_________________________________________</w:t>
+      </w:r>
+      <w:r>
+        <w:rPr>
+          <w:color w:val="000000"/>
+          <w:sz w:val="32"/>
+          <w:lang w:val="es-AR"/>
+        </w:rPr>
+        <w:t>|</w:t>
+      </w:r>
+    </w:p>
+    <w:p>
+      <w:pPr>
+        <w:widowControl w:val="0"/>
+        <w:shd w:val="clear" w:color="auto" w:fill="FFFFFF"/>
+        <w:wordWrap w:val="0"/>
+        <w:spacing w:after="0" w:line="330" w:lineRule="exact"/>
+        <w:rPr>
+          <w:lang w:val="es-AR"/>
+        </w:rPr>
+      </w:pPr>
+      <w:r>
+        <w:rPr>
+          <w:color w:val="000000"/>
+          <w:sz w:val="32"/>
+          <w:lang w:val="es-AR"/>
+        </w:rPr>
+        <w:t>|</w:t>
+      </w:r>
+      <w:r>
+        <w:rPr>
+          <w:color w:val="A6A6A6" w:themeColor="background1" w:themeShade="A6"/>
+          <w:sz w:val="32"/>
+          <w:lang w:val="es-AR"/>
+        </w:rPr>
+        <w:t>_________________________________________</w:t>
+      </w:r>
+      <w:r>
+        <w:rPr>
+          <w:color w:val="000000"/>
+          <w:sz w:val="32"/>
+          <w:lang w:val="es-AR"/>
+        </w:rPr>
+        <w:t>|  |</w:t>
+      </w:r>
+      <w:r>
+        <w:rPr>
+          <w:color w:val="A6A6A6" w:themeColor="background1" w:themeShade="A6"/>
+          <w:sz w:val="32"/>
+          <w:lang w:val="es-AR"/>
+        </w:rPr>
+        <w:t>_________________________________________</w:t>
+      </w:r>
+      <w:r>
+        <w:rPr>
+          <w:color w:val="000000"/>
+          <w:sz w:val="32"/>
+          <w:lang w:val="es-AR"/>
+        </w:rPr>
+        <w:t>|</w:t>
+      </w:r>
+    </w:p>
+    <w:p>
+      <w:pPr>
+        <w:widowControl w:val="0"/>
+        <w:shd w:val="clear" w:color="auto" w:fill="FFFFFF"/>
+        <w:wordWrap w:val="0"/>
+        <w:spacing w:after="0" w:line="330" w:lineRule="exact"/>
+        <w:rPr>
+          <w:lang w:val="es-AR"/>
+        </w:rPr>
+      </w:pPr>
+      <w:r>
+        <w:rPr>
+          <w:color w:val="000000"/>
+          <w:sz w:val="32"/>
+          <w:lang w:val="es-AR"/>
+        </w:rPr>
+        <w:t>|</w:t>
+      </w:r>
+      <w:r>
+        <w:rPr>
+          <w:color w:val="A6A6A6" w:themeColor="background1" w:themeShade="A6"/>
+          <w:sz w:val="32"/>
+          <w:lang w:val="es-AR"/>
+        </w:rPr>
+        <w:t>_________________________________________</w:t>
+      </w:r>
+      <w:r>
+        <w:rPr>
+          <w:color w:val="000000"/>
+          <w:sz w:val="32"/>
+          <w:lang w:val="es-AR"/>
+        </w:rPr>
+        <w:t>|  |</w:t>
+      </w:r>
+      <w:r>
+        <w:rPr>
+          <w:color w:val="A6A6A6" w:themeColor="background1" w:themeShade="A6"/>
+          <w:sz w:val="32"/>
+          <w:lang w:val="es-AR"/>
+        </w:rPr>
+        <w:t>_________________________________________</w:t>
+      </w:r>
+      <w:r>
+        <w:rPr>
+          <w:color w:val="000000"/>
+          <w:sz w:val="32"/>
+          <w:lang w:val="es-AR"/>
+        </w:rPr>
+        <w:t>|</w:t>
+      </w:r>
+    </w:p>
+    <w:p>
+      <w:pPr>
+        <w:widowControl w:val="0"/>
+        <w:shd w:val="clear" w:color="auto" w:fill="FFFFFF"/>
+        <w:wordWrap w:val="0"/>
+        <w:spacing w:after="0" w:line="330" w:lineRule="exact"/>
+        <w:rPr>
+          <w:lang w:val="es-AR"/>
+        </w:rPr>
+      </w:pPr>
+      <w:r>
+        <w:rPr>
+          <w:color w:val="000000"/>
+          <w:sz w:val="32"/>
+          <w:lang w:val="es-AR"/>
+        </w:rPr>
+        <w:t>|</w:t>
+      </w:r>
+      <w:r>
+        <w:rPr>
+          <w:color w:val="A6A6A6" w:themeColor="background1" w:themeShade="A6"/>
+          <w:sz w:val="32"/>
+          <w:lang w:val="es-AR"/>
+        </w:rPr>
+        <w:t>_________________________________________</w:t>
+      </w:r>
+      <w:r>
+        <w:rPr>
+          <w:color w:val="000000"/>
+          <w:sz w:val="32"/>
+          <w:lang w:val="es-AR"/>
+        </w:rPr>
+        <w:t>|  |</w:t>
+      </w:r>
+      <w:r>
+        <w:rPr>
+          <w:color w:val="A6A6A6" w:themeColor="background1" w:themeShade="A6"/>
+          <w:sz w:val="32"/>
+          <w:lang w:val="es-AR"/>
+        </w:rPr>
+        <w:t>_________________________________________</w:t>
+      </w:r>
+      <w:r>
+        <w:rPr>
+          <w:color w:val="000000"/>
+          <w:sz w:val="32"/>
+          <w:lang w:val="es-AR"/>
+        </w:rPr>
+        <w:t>|</w:t>
+      </w:r>
+    </w:p>
+    <w:p>
+      <w:pPr>
+        <w:widowControl w:val="0"/>
+        <w:shd w:val="clear" w:color="auto" w:fill="FFFFFF"/>
+        <w:wordWrap w:val="0"/>
+        <w:spacing w:after="0" w:line="330" w:lineRule="exact"/>
+        <w:rPr>
+          <w:lang w:val="es-AR"/>
+        </w:rPr>
+      </w:pPr>
+      <w:r>
+        <w:rPr>
+          <w:color w:val="000000"/>
+          <w:sz w:val="32"/>
+          <w:lang w:val="es-AR"/>
+        </w:rPr>
+        <w:t>|</w:t>
+      </w:r>
+      <w:r>
+        <w:rPr>
+          <w:color w:val="A6A6A6" w:themeColor="background1" w:themeShade="A6"/>
+          <w:sz w:val="32"/>
+          <w:lang w:val="es-AR"/>
+        </w:rPr>
+        <w:t>_________________________________________</w:t>
+      </w:r>
+      <w:r>
+        <w:rPr>
+          <w:color w:val="000000"/>
+          <w:sz w:val="32"/>
+          <w:lang w:val="es-AR"/>
+        </w:rPr>
+        <w:t>|  |</w:t>
+      </w:r>
+      <w:r>
+        <w:rPr>
+          <w:color w:val="A6A6A6" w:themeColor="background1" w:themeShade="A6"/>
+          <w:sz w:val="32"/>
+          <w:lang w:val="es-AR"/>
+        </w:rPr>
+        <w:t>_________________________________________</w:t>
+      </w:r>
+      <w:r>
+        <w:rPr>
+          <w:color w:val="000000"/>
+          <w:sz w:val="32"/>
+          <w:lang w:val="es-AR"/>
+        </w:rPr>
+        <w:t>|</w:t>
+      </w:r>
+    </w:p>
+    <w:p>
+      <w:pPr>
+        <w:widowControl w:val="0"/>
+        <w:shd w:val="clear" w:color="auto" w:fill="FFFFFF"/>
+        <w:wordWrap w:val="0"/>
+        <w:spacing w:after="0" w:line="330" w:lineRule="exact"/>
+        <w:rPr>
+          <w:lang w:val="es-AR"/>
+        </w:rPr>
+      </w:pPr>
+      <w:r>
+        <w:rPr>
+          <w:color w:val="000000"/>
+          <w:sz w:val="32"/>
+          <w:lang w:val="es-AR"/>
+        </w:rPr>
+        <w:t>|</w:t>
+      </w:r>
+      <w:r>
+        <w:rPr>
+          <w:color w:val="A6A6A6" w:themeColor="background1" w:themeShade="A6"/>
+          <w:sz w:val="32"/>
+          <w:lang w:val="es-AR"/>
+        </w:rPr>
+        <w:t>_________________________________________</w:t>
+      </w:r>
+      <w:r>
+        <w:rPr>
+          <w:color w:val="000000"/>
+          <w:sz w:val="32"/>
+          <w:lang w:val="es-AR"/>
+        </w:rPr>
+        <w:t>|  |</w:t>
+      </w:r>
+      <w:r>
+        <w:rPr>
+          <w:color w:val="A6A6A6" w:themeColor="background1" w:themeShade="A6"/>
+          <w:sz w:val="32"/>
+          <w:lang w:val="es-AR"/>
+        </w:rPr>
+        <w:t>_________________________________________</w:t>
+      </w:r>
+      <w:r>
+        <w:rPr>
+          <w:color w:val="000000"/>
+          <w:sz w:val="32"/>
+          <w:lang w:val="es-AR"/>
+        </w:rPr>
+        <w:t>|</w:t>
+      </w:r>
+    </w:p>
+    <w:p>
+      <w:pPr>
+        <w:widowControl w:val="0"/>
+        <w:shd w:val="clear" w:color="auto" w:fill="FFFFFF"/>
+        <w:wordWrap w:val="0"/>
+        <w:spacing w:after="0" w:line="330" w:lineRule="exact"/>
+        <w:rPr>
+          <w:lang w:val="es-AR"/>
+        </w:rPr>
+      </w:pPr>
+      <w:r>
+        <w:rPr>
+          <w:color w:val="000000"/>
+          <w:sz w:val="32"/>
+          <w:lang w:val="es-AR"/>
+        </w:rPr>
+        <w:t xml:space="preserve">                                                                                </w:t>
+      </w:r>
+    </w:p>
+    <w:p>
+      <w:pPr>
+        <w:widowControl w:val="0"/>
+        <w:shd w:val="clear" w:color="auto" w:fill="FFFFFF"/>
+        <w:wordWrap w:val="0"/>
+        <w:spacing w:after="0" w:line="330" w:lineRule="exact"/>
+        <w:rPr>
+          <w:lang w:val="es-AR"/>
+        </w:rPr>
+      </w:pPr>
+      <w:r>
+        <w:rPr>
+          <w:color w:val="000000"/>
+          <w:sz w:val="32"/>
+          <w:lang w:val="es-AR"/>
+        </w:rPr>
+        <w:t>Experiencia:</w:t>
+      </w:r>
+      <w:r>
+        <w:rPr>
+          <w:color w:val="A6A6A6" w:themeColor="background1" w:themeShade="A6"/>
+          <w:sz w:val="32"/>
+          <w:lang w:val="es-AR"/>
+        </w:rPr>
+        <w:t>____________________________________________________________________________</w:t>
+      </w:r>
+    </w:p>
     <w:sectPr>
-      <w:type w:val="continuous"/>
+      <w:headerReference w:type="default" r:id="rId14"/>
+      <w:footerReference w:type="default" r:id="rId15"/>
       <w:pgSz w:w="11906" w:h="16838"/>
-      <w:pgMar w:top="685" w:right="284" w:bottom="284" w:left="284" w:header="284" w:footer="454" w:gutter="0"/>
-      <w:cols w:num="2" w:space="283"/>
+      <w:pgMar w:top="918" w:right="283" w:bottom="0" w:left="283" w:header="98" w:footer="0" w:gutter="0"/>
+      <w:cols w:space="720"/>
       <w:docGrid w:linePitch="360"/>
     </w:sectPr>
   </w:body>
@@ -26425,6 +28995,12 @@
 </w:ftr>
 </file>
 
+<file path=word/footer4.xml><?xml version="1.0" encoding="utf-8"?>
+<w:ftr xmlns:wpc="http://schemas.microsoft.com/office/word/2010/wordprocessingCanvas" xmlns:cx="http://schemas.microsoft.com/office/drawing/2014/chartex" xmlns:cx1="http://schemas.microsoft.com/office/drawing/2015/9/8/chartex" xmlns:cx2="http://schemas.microsoft.com/office/drawing/2015/10/21/chartex" xmlns:cx3="http://schemas.microsoft.com/office/drawing/2016/5/9/chartex" xmlns:cx4="http://schemas.microsoft.com/office/drawing/2016/5/10/chartex" xmlns:cx5="http://schemas.microsoft.com/office/drawing/2016/5/11/chartex" xmlns:cx6="http://schemas.microsoft.com/office/drawing/2016/5/12/chartex" xmlns:cx7="http://schemas.microsoft.com/office/drawing/2016/5/13/chartex" xmlns:cx8="http://schemas.microsoft.com/office/drawing/2016/5/14/chartex" xmlns:mc="http://schemas.openxmlformats.org/markup-compatibility/2006" xmlns:m="http://schemas.openxmlformats.org/officeDocument/2006/math" xmlns:aink="http://schemas.microsoft.com/office/drawing/2016/ink" xmlns:am3d="http://schemas.microsoft.com/office/drawing/2017/model3d" xmlns:oel="http://schemas.microsoft.com/office/2019/extlst" xmlns:r="http://schemas.openxmlformats.org/officeDocument/2006/relationships" xmlns:wp14="http://schemas.microsoft.com/office/word/2010/wordprocessingDrawing" xmlns:wp="http://schemas.openxmlformats.org/drawingml/2006/wordprocessingDrawing" xmlns:wpg="http://schemas.microsoft.com/office/word/2010/wordprocessingGroup" xmlns:wpi="http://schemas.microsoft.com/office/word/2010/wordprocessingInk" xmlns:wps="http://schemas.microsoft.com/office/word/2010/wordprocessingShape" xmlns:o="urn:schemas-microsoft-com:office:office" xmlns:v="urn:schemas-microsoft-com:vml" xmlns:w10="urn:schemas-microsoft-com:office:word" xmlns:w="http://schemas.openxmlformats.org/wordprocessingml/2006/main" xmlns:w14="http://schemas.microsoft.com/office/word/2010/wordml" xmlns:w15="http://schemas.microsoft.com/office/word/2012/wordml" xmlns:w16cex="http://schemas.microsoft.com/office/word/2018/wordml/cex" xmlns:w16cid="http://schemas.microsoft.com/office/word/2016/wordml/cid" xmlns:w16="http://schemas.microsoft.com/office/word/2018/wordml" xmlns:w16sdtdh="http://schemas.microsoft.com/office/word/2020/wordml/sdtdatahash" xmlns:w16sdtfl="http://schemas.microsoft.com/office/word/2024/wordml/sdtformatlock" xmlns:w16se="http://schemas.microsoft.com/office/word/2015/wordml/symex" xmlns:w16du="http://schemas.microsoft.com/office/word/2023/wordml/word16du" xmlns:wne="http://schemas.microsoft.com/office/word/2006/wordml" mc:Ignorable="w14 w15 w16se w16cid w16 w16cex w16sdtdh w16sdtfl w16du wp14">
+  <w:p/>
+</w:ftr>
+</file>
+
 <file path=word/footnotes.xml><?xml version="1.0" encoding="utf-8"?>
 <w:footnotes xmlns:wpc="http://schemas.microsoft.com/office/word/2010/wordprocessingCanvas" xmlns:cx="http://schemas.microsoft.com/office/drawing/2014/chartex" xmlns:cx1="http://schemas.microsoft.com/office/drawing/2015/9/8/chartex" xmlns:cx2="http://schemas.microsoft.com/office/drawing/2015/10/21/chartex" xmlns:cx3="http://schemas.microsoft.com/office/drawing/2016/5/9/chartex" xmlns:cx4="http://schemas.microsoft.com/office/drawing/2016/5/10/chartex" xmlns:cx5="http://schemas.microsoft.com/office/drawing/2016/5/11/chartex" xmlns:cx6="http://schemas.microsoft.com/office/drawing/2016/5/12/chartex" xmlns:cx7="http://schemas.microsoft.com/office/drawing/2016/5/13/chartex" xmlns:cx8="http://schemas.microsoft.com/office/drawing/2016/5/14/chartex" xmlns:mc="http://schemas.openxmlformats.org/markup-compatibility/2006" xmlns:m="http://schemas.openxmlformats.org/officeDocument/2006/math" xmlns:aink="http://schemas.microsoft.com/office/drawing/2016/ink" xmlns:am3d="http://schemas.microsoft.com/office/drawing/2017/model3d" xmlns:oel="http://schemas.microsoft.com/office/2019/extlst" xmlns:r="http://schemas.openxmlformats.org/officeDocument/2006/relationships" xmlns:wp14="http://schemas.microsoft.com/office/word/2010/wordprocessingDrawing" xmlns:wp="http://schemas.openxmlformats.org/drawingml/2006/wordprocessingDrawing" xmlns:wpg="http://schemas.microsoft.com/office/word/2010/wordprocessingGroup" xmlns:wpi="http://schemas.microsoft.com/office/word/2010/wordprocessingInk" xmlns:wps="http://schemas.microsoft.com/office/word/2010/wordprocessingShape" xmlns:o="urn:schemas-microsoft-com:office:office" xmlns:v="urn:schemas-microsoft-com:vml" xmlns:w10="urn:schemas-microsoft-com:office:word" xmlns:w="http://schemas.openxmlformats.org/wordprocessingml/2006/main" xmlns:w14="http://schemas.microsoft.com/office/word/2010/wordml" xmlns:w15="http://schemas.microsoft.com/office/word/2012/wordml" xmlns:w16cex="http://schemas.microsoft.com/office/word/2018/wordml/cex" xmlns:w16cid="http://schemas.microsoft.com/office/word/2016/wordml/cid" xmlns:w16="http://schemas.microsoft.com/office/word/2018/wordml" xmlns:w16sdtdh="http://schemas.microsoft.com/office/word/2020/wordml/sdtdatahash" xmlns:w16sdtfl="http://schemas.microsoft.com/office/word/2024/wordml/sdtformatlock" xmlns:w16se="http://schemas.microsoft.com/office/word/2015/wordml/symex" xmlns:w16du="http://schemas.microsoft.com/office/word/2023/wordml/word16du" xmlns:wne="http://schemas.microsoft.com/office/word/2006/wordml" mc:Ignorable="w14 w15 w16se w16cid w16 w16cex w16sdtdh w16sdtfl w16du wp14">
   <w:footnote w:type="separator" w:id="-1">
@@ -26568,7 +29144,7 @@
         <w:szCs w:val="6"/>
         <w:lang w:val="es-AR"/>
       </w:rPr>
-      <w:t>pbta:\&gt;/___/                   /_/</w:t>
+      <w:t>PbtA:\&gt;/___/                   /_/</w:t>
     </w:r>
     <w:r>
       <w:rPr>
@@ -26589,6 +29165,180 @@
     <w:pPr>
       <w:pStyle w:val="Encabezado"/>
     </w:pPr>
+  </w:p>
+</w:hdr>
+</file>
+
+<file path=word/header4.xml><?xml version="1.0" encoding="utf-8"?>
+<w:hdr xmlns:wpc="http://schemas.microsoft.com/office/word/2010/wordprocessingCanvas" xmlns:cx="http://schemas.microsoft.com/office/drawing/2014/chartex" xmlns:cx1="http://schemas.microsoft.com/office/drawing/2015/9/8/chartex" xmlns:cx2="http://schemas.microsoft.com/office/drawing/2015/10/21/chartex" xmlns:cx3="http://schemas.microsoft.com/office/drawing/2016/5/9/chartex" xmlns:cx4="http://schemas.microsoft.com/office/drawing/2016/5/10/chartex" xmlns:cx5="http://schemas.microsoft.com/office/drawing/2016/5/11/chartex" xmlns:cx6="http://schemas.microsoft.com/office/drawing/2016/5/12/chartex" xmlns:cx7="http://schemas.microsoft.com/office/drawing/2016/5/13/chartex" xmlns:cx8="http://schemas.microsoft.com/office/drawing/2016/5/14/chartex" xmlns:mc="http://schemas.openxmlformats.org/markup-compatibility/2006" xmlns:m="http://schemas.openxmlformats.org/officeDocument/2006/math" xmlns:aink="http://schemas.microsoft.com/office/drawing/2016/ink" xmlns:am3d="http://schemas.microsoft.com/office/drawing/2017/model3d" xmlns:oel="http://schemas.microsoft.com/office/2019/extlst" xmlns:r="http://schemas.openxmlformats.org/officeDocument/2006/relationships" xmlns:wp14="http://schemas.microsoft.com/office/word/2010/wordprocessingDrawing" xmlns:wp="http://schemas.openxmlformats.org/drawingml/2006/wordprocessingDrawing" xmlns:wpg="http://schemas.microsoft.com/office/word/2010/wordprocessingGroup" xmlns:wpi="http://schemas.microsoft.com/office/word/2010/wordprocessingInk" xmlns:wps="http://schemas.microsoft.com/office/word/2010/wordprocessingShape" xmlns:o="urn:schemas-microsoft-com:office:office" xmlns:v="urn:schemas-microsoft-com:vml" xmlns:w10="urn:schemas-microsoft-com:office:word" xmlns:w="http://schemas.openxmlformats.org/wordprocessingml/2006/main" xmlns:w14="http://schemas.microsoft.com/office/word/2010/wordml" xmlns:w15="http://schemas.microsoft.com/office/word/2012/wordml" xmlns:w16cex="http://schemas.microsoft.com/office/word/2018/wordml/cex" xmlns:w16cid="http://schemas.microsoft.com/office/word/2016/wordml/cid" xmlns:w16="http://schemas.microsoft.com/office/word/2018/wordml" xmlns:w16sdtdh="http://schemas.microsoft.com/office/word/2020/wordml/sdtdatahash" xmlns:w16sdtfl="http://schemas.microsoft.com/office/word/2024/wordml/sdtformatlock" xmlns:w16se="http://schemas.microsoft.com/office/word/2015/wordml/symex" xmlns:w16du="http://schemas.microsoft.com/office/word/2023/wordml/word16du" xmlns:wne="http://schemas.microsoft.com/office/word/2006/wordml" mc:Ignorable="w14 w15 w16se w16cid w16 w16cex w16sdtdh w16sdtfl w16du wp14">
+  <w:p>
+    <w:pPr>
+      <w:widowControl w:val="0"/>
+      <w:shd w:val="clear" w:color="auto" w:fill="FFFFFF"/>
+      <w:wordWrap w:val="0"/>
+      <w:spacing w:after="0"/>
+      <w:ind w:left="3261"/>
+      <w:rPr>
+        <w:rFonts w:ascii="Courier New" w:hAnsi="Courier New" w:cs="Courier New"/>
+        <w:sz w:val="14"/>
+        <w:szCs w:val="14"/>
+        <w:lang w:val="es-AR"/>
+      </w:rPr>
+    </w:pPr>
+    <w:r>
+      <w:rPr>
+        <w:rFonts w:ascii="Courier New" w:eastAsia="Courier New" w:hAnsi="Courier New" w:cs="Courier New"/>
+        <w:b/>
+        <w:color w:val="000000"/>
+        <w:sz w:val="14"/>
+        <w:szCs w:val="14"/>
+        <w:lang w:val="es-AR"/>
+      </w:rPr>
+      <w:t xml:space="preserve">  _____          __                                  __</w:t>
+    </w:r>
+  </w:p>
+  <w:p>
+    <w:pPr>
+      <w:widowControl w:val="0"/>
+      <w:shd w:val="clear" w:color="auto" w:fill="FFFFFF"/>
+      <w:wordWrap w:val="0"/>
+      <w:spacing w:after="0"/>
+      <w:ind w:left="3261"/>
+      <w:rPr>
+        <w:rFonts w:ascii="Courier New" w:hAnsi="Courier New" w:cs="Courier New"/>
+        <w:sz w:val="14"/>
+        <w:szCs w:val="14"/>
+        <w:lang w:val="es-AR"/>
+      </w:rPr>
+    </w:pPr>
+    <w:r>
+      <w:rPr>
+        <w:rFonts w:ascii="Courier New" w:eastAsia="Courier New" w:hAnsi="Courier New" w:cs="Courier New"/>
+        <w:b/>
+        <w:color w:val="000000"/>
+        <w:sz w:val="14"/>
+        <w:szCs w:val="14"/>
+        <w:lang w:val="es-AR"/>
+      </w:rPr>
+      <w:t xml:space="preserve"> / ___/  __ __  / /  ___   ____   ___  __ __  ___   / /__</w:t>
+    </w:r>
+  </w:p>
+  <w:p>
+    <w:pPr>
+      <w:widowControl w:val="0"/>
+      <w:shd w:val="clear" w:color="auto" w:fill="FFFFFF"/>
+      <w:wordWrap w:val="0"/>
+      <w:spacing w:after="0"/>
+      <w:ind w:left="3261"/>
+      <w:rPr>
+        <w:rFonts w:ascii="Courier New" w:hAnsi="Courier New" w:cs="Courier New"/>
+        <w:sz w:val="14"/>
+        <w:szCs w:val="14"/>
+        <w:lang w:val="es-AR"/>
+      </w:rPr>
+    </w:pPr>
+    <w:r>
+      <w:rPr>
+        <w:rFonts w:ascii="Courier New" w:eastAsia="Courier New" w:hAnsi="Courier New" w:cs="Courier New"/>
+        <w:b/>
+        <w:color w:val="000000"/>
+        <w:sz w:val="14"/>
+        <w:szCs w:val="14"/>
+        <w:lang w:val="es-AR"/>
+      </w:rPr>
+      <w:t>/ /__   / // / / _ \/ -_) / __/  / _ \/ // / / _ \ /  '_/</w:t>
+    </w:r>
+  </w:p>
+  <w:p>
+    <w:pPr>
+      <w:widowControl w:val="0"/>
+      <w:shd w:val="clear" w:color="auto" w:fill="FFFFFF"/>
+      <w:wordWrap w:val="0"/>
+      <w:spacing w:after="0"/>
+      <w:ind w:left="3261"/>
+      <w:rPr>
+        <w:rFonts w:ascii="Courier New" w:hAnsi="Courier New" w:cs="Courier New"/>
+        <w:sz w:val="14"/>
+        <w:szCs w:val="14"/>
+        <w:lang w:val="es-AR"/>
+      </w:rPr>
+    </w:pPr>
+    <w:r>
+      <w:rPr>
+        <w:rFonts w:ascii="Courier New" w:eastAsia="Courier New" w:hAnsi="Courier New" w:cs="Courier New"/>
+        <w:b/>
+        <w:color w:val="000000"/>
+        <w:sz w:val="14"/>
+        <w:szCs w:val="14"/>
+        <w:lang w:val="es-AR"/>
+      </w:rPr>
+      <w:t>\___/   \_, / /_.__/\__/ /_/    / .__/\_,_/ /_//_//_/\_\</w:t>
+    </w:r>
+  </w:p>
+  <w:p>
+    <w:pPr>
+      <w:widowControl w:val="0"/>
+      <w:shd w:val="clear" w:color="auto" w:fill="FFFFFF"/>
+      <w:wordWrap w:val="0"/>
+      <w:spacing w:after="0"/>
+      <w:ind w:left="3261"/>
+      <w:rPr>
+        <w:rFonts w:ascii="Courier New" w:hAnsi="Courier New" w:cs="Courier New"/>
+        <w:sz w:val="14"/>
+        <w:szCs w:val="14"/>
+        <w:lang w:val="es-AR"/>
+      </w:rPr>
+    </w:pPr>
+    <w:r>
+      <w:rPr>
+        <w:rFonts w:ascii="Courier New" w:eastAsia="Courier New" w:hAnsi="Courier New" w:cs="Courier New"/>
+        <w:b/>
+        <w:color w:val="000000"/>
+        <w:sz w:val="14"/>
+        <w:szCs w:val="14"/>
+        <w:lang w:val="es-AR"/>
+      </w:rPr>
+      <w:t xml:space="preserve"> </w:t>
+    </w:r>
+    <w:r>
+      <w:rPr>
+        <w:rFonts w:ascii="Courier New" w:eastAsia="Courier New" w:hAnsi="Courier New" w:cs="Courier New"/>
+        <w:b/>
+        <w:color w:val="000000"/>
+        <w:sz w:val="14"/>
+        <w:szCs w:val="14"/>
+        <w:lang w:val="es-AR"/>
+      </w:rPr>
+      <w:t xml:space="preserve"> </w:t>
+    </w:r>
+    <w:r>
+      <w:rPr>
+        <w:rFonts w:eastAsia="Courier New" w:cs="Courier New"/>
+        <w:b/>
+        <w:color w:val="000000"/>
+        <w:sz w:val="14"/>
+        <w:szCs w:val="14"/>
+        <w:lang w:val="es-AR"/>
+      </w:rPr>
+      <w:t>PbtA:\&gt;</w:t>
+    </w:r>
+    <w:r>
+      <w:rPr>
+        <w:rFonts w:ascii="Courier New" w:eastAsia="Courier New" w:hAnsi="Courier New" w:cs="Courier New"/>
+        <w:b/>
+        <w:color w:val="000000"/>
+        <w:sz w:val="14"/>
+        <w:szCs w:val="14"/>
+        <w:lang w:val="es-AR"/>
+      </w:rPr>
+      <w:t xml:space="preserve">/___/                   /_/ </w:t>
+    </w:r>
+    <w:r>
+      <w:tab/>
+    </w:r>
+    <w:r>
+      <w:tab/>
+    </w:r>
   </w:p>
 </w:hdr>
 </file>

</xml_diff>

<commit_message>
Freeze manual ficha as golden and restyle web sheet to ASCII pipe layout.
Sync ficha.docx and layout snapshot from the edited manual, align print palette docs, and render Cromos/Chapería rows as |___| on green-on-black web.

Co-authored-by: Cursor <cursoragent@cursor.com>
</commit_message>
<xml_diff>
--- a/cyberpunk-pbta.docx
+++ b/cyberpunk-pbta.docx
@@ -26292,7 +26292,7 @@
           <w:sz w:val="32"/>
           <w:lang w:val="es-AR"/>
         </w:rPr>
-        <w:t xml:space="preserve">                             </w:t>
+        <w:t xml:space="preserve"> </w:t>
       </w:r>
     </w:p>
     <w:p>
@@ -26777,7 +26777,7 @@
           <w:sz w:val="32"/>
           <w:lang w:val="es-AR"/>
         </w:rPr>
-        <w:t xml:space="preserve">Falla </w:t>
+        <w:t>Falla</w:t>
       </w:r>
     </w:p>
     <w:p>
@@ -26983,7 +26983,7 @@
           <w:sz w:val="32"/>
           <w:lang w:val="es-AR"/>
         </w:rPr>
-        <w:t xml:space="preserve">][ ][ ]  </w:t>
+        <w:t xml:space="preserve">][ ][ ] </w:t>
       </w:r>
     </w:p>
     <w:p>
@@ -26993,16 +26993,82 @@
         <w:wordWrap w:val="0"/>
         <w:spacing w:after="0" w:line="330" w:lineRule="exact"/>
         <w:rPr>
-          <w:lang w:val="es-AR"/>
-        </w:rPr>
-      </w:pPr>
-      <w:r>
-        <w:rPr>
           <w:color w:val="000000"/>
           <w:sz w:val="32"/>
           <w:lang w:val="es-AR"/>
         </w:rPr>
-        <w:t xml:space="preserve">                                                                                </w:t>
+      </w:pPr>
+      <w:r>
+        <w:rPr>
+          <w:color w:val="000000"/>
+          <w:sz w:val="32"/>
+          <w:lang w:val="es-AR"/>
+        </w:rPr>
+        <w:t>[</w:t>
+      </w:r>
+      <w:r>
+        <w:rPr>
+          <w:color w:val="000000"/>
+          <w:sz w:val="32"/>
+          <w:lang w:val="es-AR"/>
+        </w:rPr>
+        <w:t xml:space="preserve">················ </w:t>
+      </w:r>
+      <w:r>
+        <w:rPr>
+          <w:color w:val="000000"/>
+          <w:sz w:val="32"/>
+          <w:lang w:val="es-AR"/>
+        </w:rPr>
+        <w:t>Cromos</w:t>
+      </w:r>
+      <w:r>
+        <w:rPr>
+          <w:color w:val="000000"/>
+          <w:sz w:val="32"/>
+          <w:lang w:val="es-AR"/>
+        </w:rPr>
+        <w:t xml:space="preserve"> ·················</w:t>
+      </w:r>
+      <w:r>
+        <w:rPr>
+          <w:color w:val="000000"/>
+          <w:sz w:val="32"/>
+          <w:lang w:val="es-AR"/>
+        </w:rPr>
+        <w:t>]  [</w:t>
+      </w:r>
+      <w:r>
+        <w:rPr>
+          <w:color w:val="000000"/>
+          <w:sz w:val="32"/>
+          <w:lang w:val="es-AR"/>
+        </w:rPr>
+        <w:t xml:space="preserve">··············· </w:t>
+      </w:r>
+      <w:r>
+        <w:rPr>
+          <w:color w:val="000000"/>
+          <w:sz w:val="32"/>
+          <w:lang w:val="es-AR"/>
+        </w:rPr>
+        <w:t>Chapería</w:t>
+      </w:r>
+      <w:r>
+        <w:rPr>
+          <w:color w:val="000000"/>
+          <w:sz w:val="32"/>
+          <w:lang w:val="es-AR"/>
+        </w:rPr>
+        <w:t xml:space="preserve"> ················</w:t>
+      </w:r>
+      <w:r>
+        <w:rPr>
+          <w:color w:val="000000"/>
+          <w:sz w:val="32"/>
+          <w:lang w:val="es-AR"/>
+        </w:rPr>
+        <w:t>]</w:t>
       </w:r>
     </w:p>
     <w:p>
@@ -27012,83 +27078,9 @@
         <w:wordWrap w:val="0"/>
         <w:spacing w:after="0" w:line="330" w:lineRule="exact"/>
         <w:rPr>
-          <w:color w:val="000000"/>
-          <w:sz w:val="32"/>
-          <w:lang w:val="es-AR"/>
-        </w:rPr>
-      </w:pPr>
-      <w:r>
-        <w:rPr>
-          <w:color w:val="000000"/>
-          <w:sz w:val="32"/>
-          <w:lang w:val="es-AR"/>
-        </w:rPr>
-        <w:t>[</w:t>
-      </w:r>
-      <w:r>
-        <w:rPr>
-          <w:color w:val="000000"/>
-          <w:sz w:val="32"/>
-          <w:lang w:val="es-AR"/>
-        </w:rPr>
-        <w:t xml:space="preserve">················ </w:t>
-      </w:r>
-      <w:r>
-        <w:rPr>
-          <w:color w:val="000000"/>
-          <w:sz w:val="32"/>
-          <w:lang w:val="es-AR"/>
-        </w:rPr>
-        <w:t>Cromos</w:t>
-      </w:r>
-      <w:r>
-        <w:rPr>
-          <w:color w:val="000000"/>
-          <w:sz w:val="32"/>
-          <w:lang w:val="es-AR"/>
-        </w:rPr>
-        <w:t xml:space="preserve"> ·················</w:t>
-      </w:r>
-      <w:r>
-        <w:rPr>
-          <w:color w:val="000000"/>
-          <w:sz w:val="32"/>
-          <w:lang w:val="es-AR"/>
-        </w:rPr>
-        <w:t>]  [</w:t>
-      </w:r>
-      <w:r>
-        <w:rPr>
-          <w:color w:val="000000"/>
-          <w:sz w:val="32"/>
-          <w:lang w:val="es-AR"/>
-        </w:rPr>
-        <w:t xml:space="preserve">··············· </w:t>
-      </w:r>
-      <w:r>
-        <w:rPr>
-          <w:color w:val="000000"/>
-          <w:sz w:val="32"/>
-          <w:lang w:val="es-AR"/>
-        </w:rPr>
-        <w:t>Chapería</w:t>
-      </w:r>
-      <w:r>
-        <w:rPr>
-          <w:color w:val="000000"/>
-          <w:sz w:val="32"/>
-          <w:lang w:val="es-AR"/>
-        </w:rPr>
-        <w:t xml:space="preserve"> ················</w:t>
-      </w:r>
-      <w:r>
-        <w:rPr>
-          <w:color w:val="000000"/>
-          <w:sz w:val="32"/>
-          <w:lang w:val="es-AR"/>
-        </w:rPr>
-        <w:t>]</w:t>
-      </w:r>
+          <w:lang w:val="es-AR"/>
+        </w:rPr>
+      </w:pPr>
     </w:p>
     <w:p>
       <w:pPr>
@@ -27100,6 +27092,46 @@
           <w:lang w:val="es-AR"/>
         </w:rPr>
       </w:pPr>
+      <w:r>
+        <w:rPr>
+          <w:color w:val="000000"/>
+          <w:sz w:val="32"/>
+          <w:lang w:val="es-AR"/>
+        </w:rPr>
+        <w:t>|</w:t>
+      </w:r>
+      <w:r>
+        <w:rPr>
+          <w:color w:val="A6A6A6" w:themeColor="background1" w:themeShade="A6"/>
+          <w:sz w:val="32"/>
+          <w:lang w:val="es-AR"/>
+        </w:rPr>
+        <w:t>_________________________________________</w:t>
+      </w:r>
+      <w:r>
+        <w:rPr>
+          <w:color w:val="000000"/>
+          <w:sz w:val="32"/>
+          <w:lang w:val="es-AR"/>
+        </w:rPr>
+        <w:t>|  |</w:t>
+      </w:r>
+      <w:r>
+        <w:rPr>
+          <w:color w:val="A6A6A6" w:themeColor="background1" w:themeShade="A6"/>
+          <w:sz w:val="32"/>
+          <w:lang w:val="es-AR"/>
+        </w:rPr>
+        <w:t>_________________________________________</w:t>
+      </w:r>
+      <w:r>
+        <w:rPr>
+          <w:color w:val="000000"/>
+          <w:sz w:val="32"/>
+          <w:lang w:val="es-AR"/>
+        </w:rPr>
+        <w:t>|</w:t>
+      </w:r>
     </w:p>
     <w:p>
       <w:pPr>
@@ -28749,7 +28781,7 @@
           <w:sz w:val="32"/>
           <w:lang w:val="es-AR"/>
         </w:rPr>
-        <w:t xml:space="preserve">                                                                                </w:t>
+        <w:t xml:space="preserve"> </w:t>
       </w:r>
     </w:p>
     <w:p>
@@ -28772,11 +28804,19 @@
       </w:r>
       <w:r>
         <w:rPr>
+          <w:color w:val="auto"/>
+          <w:sz w:val="32"/>
+          <w:lang w:val="es-AR"/>
+        </w:rPr>
+        <w:t>\&gt;</w:t>
+      </w:r>
+      <w:r>
+        <w:rPr>
           <w:color w:val="A6A6A6" w:themeColor="background1" w:themeShade="A6"/>
           <w:sz w:val="32"/>
           <w:lang w:val="es-AR"/>
         </w:rPr>
-        <w:t>____________________________________________________________________________</w:t>
+        <w:t>__________________________________________________________________________</w:t>
       </w:r>
     </w:p>
     <w:sectPr>
@@ -29493,10 +29533,11 @@
   <w:abstractNum w:abstractNumId="8" w15:restartNumberingAfterBreak="0">
     <w:nsid w:val="FFFFFF89"/>
     <w:multiLevelType w:val="singleLevel"/>
-    <w:tmpl w:val="29761A62"/>
+    <w:tmpl w:val="10BA0CBE"/>
     <w:lvl w:ilvl="0">
       <w:start w:val="1"/>
       <w:numFmt w:val="bullet"/>
+      <w:pStyle w:val="Listaconvietas"/>
       <w:lvlText w:val=""/>
       <w:lvlJc w:val="left"/>
       <w:pPr>
@@ -29825,6 +29866,9 @@
   </w:num>
   <w:num w:numId="3" w16cid:durableId="1541746439">
     <w:abstractNumId w:val="11"/>
+  </w:num>
+  <w:num w:numId="4" w16cid:durableId="328143265">
+    <w:abstractNumId w:val="8"/>
   </w:num>
 </w:numbering>
 </file>

</xml_diff>